<commit_message>
feat: implement contract generation service, document templates, and context snapshots
</commit_message>
<xml_diff>
--- a/hs-contract-service/contract-template/HomeSpace_03_Hop_Dong_Thue_Phong_Tro.docx
+++ b/hs-contract-service/contract-template/HomeSpace_03_Hop_Dong_Thue_Phong_Tro.docx
@@ -4,12 +4,11 @@
   <w:body>
     <w:p>
       <w:pPr>
-        <w:spacing w:before="0" w:after="0"/>
         <w:jc w:val="center"/>
       </w:pPr>
       <w:r>
         <w:rPr>
-          <w:rFonts w:ascii="Times New Roman" w:hAnsi="Times New Roman"/>
+          <w:rFonts w:ascii="Times New Roman" w:hAnsi="Times New Roman" w:eastAsia="Times New Roman"/>
           <w:b/>
           <w:i w:val="0"/>
           <w:sz w:val="26"/>
@@ -19,12 +18,12 @@
     </w:p>
     <w:p>
       <w:pPr>
-        <w:spacing w:before="0" w:after="140"/>
+        <w:spacing w:after="140"/>
         <w:jc w:val="center"/>
       </w:pPr>
       <w:r>
         <w:rPr>
-          <w:rFonts w:ascii="Times New Roman" w:hAnsi="Times New Roman"/>
+          <w:rFonts w:ascii="Times New Roman" w:hAnsi="Times New Roman" w:eastAsia="Times New Roman"/>
           <w:b/>
           <w:i w:val="0"/>
           <w:sz w:val="26"/>
@@ -34,813 +33,508 @@
     </w:p>
     <w:p>
       <w:pPr>
-        <w:spacing w:before="0" w:after="40"/>
+        <w:spacing w:after="40"/>
         <w:jc w:val="center"/>
       </w:pPr>
       <w:r>
         <w:rPr>
-          <w:rFonts w:ascii="Times New Roman" w:hAnsi="Times New Roman"/>
+          <w:rFonts w:ascii="Times New Roman" w:hAnsi="Times New Roman" w:eastAsia="Times New Roman"/>
           <w:b/>
           <w:i w:val="0"/>
-          <w:sz w:val="32"/>
+          <w:sz w:val="30"/>
         </w:rPr>
         <w:t>HỢP ĐỒNG THUÊ PHÒNG TRỌ</w:t>
       </w:r>
     </w:p>
     <w:p>
       <w:pPr>
-        <w:spacing w:before="0" w:after="140"/>
+        <w:keepNext w:val="0"/>
+        <w:spacing w:before="0" w:after="100" w:line="276" w:lineRule="auto"/>
         <w:jc w:val="center"/>
       </w:pPr>
       <w:r>
         <w:rPr>
-          <w:rFonts w:ascii="Times New Roman" w:hAnsi="Times New Roman"/>
-          <w:b/>
-          <w:i w:val="0"/>
-          <w:sz w:val="26"/>
-        </w:rPr>
-        <w:t>Số: {{contract.number}}</w:t>
-      </w:r>
-    </w:p>
-    <w:p>
-      <w:pPr>
-        <w:pStyle w:val="Clause"/>
-        <w:jc w:val="left"/>
-      </w:pPr>
-      <w:r>
-        <w:rPr>
-          <w:rFonts w:ascii="Times New Roman" w:hAnsi="Times New Roman"/>
-          <w:b/>
-          <w:i w:val="0"/>
-          <w:sz w:val="26"/>
-        </w:rPr>
-        <w:t>Căn cứ:</w:t>
-      </w:r>
-    </w:p>
-    <w:p>
-      <w:pPr>
-        <w:pStyle w:val="Clause"/>
-        <w:ind w:left="283" w:hanging="142"/>
-      </w:pPr>
-      <w:r>
-        <w:rPr>
-          <w:rFonts w:ascii="Times New Roman" w:hAnsi="Times New Roman"/>
-          <w:sz w:val="25"/>
-        </w:rPr>
-        <w:t>• Bộ luật Dân sự số 91/2015/QH13 ngày 24/11/2015 và các quy định về hợp đồng thuê tài sản;</w:t>
-      </w:r>
-    </w:p>
-    <w:p>
-      <w:pPr>
-        <w:pStyle w:val="Clause"/>
-        <w:ind w:left="283" w:hanging="142"/>
-      </w:pPr>
-      <w:r>
-        <w:rPr>
-          <w:rFonts w:ascii="Times New Roman" w:hAnsi="Times New Roman"/>
-          <w:sz w:val="25"/>
-        </w:rPr>
-        <w:t>• Luật Nhà ở số 27/2023/QH15 ngày 27/11/2023 và các quy định áp dụng đối với nhà ở cho thuê, nhà ở nhiều tầng nhiều căn hộ của cá nhân trong trường hợp phù hợp;</w:t>
-      </w:r>
-    </w:p>
-    <w:p>
-      <w:pPr>
-        <w:pStyle w:val="Clause"/>
-        <w:ind w:left="283" w:hanging="142"/>
-      </w:pPr>
-      <w:r>
-        <w:rPr>
-          <w:rFonts w:ascii="Times New Roman" w:hAnsi="Times New Roman"/>
-          <w:sz w:val="25"/>
-        </w:rPr>
-        <w:t>• Luật Cư trú số 68/2020/QH14 ngày 13/11/2020 và các quy định hiện hành về đăng ký tạm trú, thông báo lưu trú;</w:t>
-      </w:r>
-    </w:p>
-    <w:p>
-      <w:pPr>
-        <w:pStyle w:val="Clause"/>
-        <w:ind w:left="283" w:hanging="142"/>
-      </w:pPr>
-      <w:r>
-        <w:rPr>
-          <w:rFonts w:ascii="Times New Roman" w:hAnsi="Times New Roman"/>
-          <w:sz w:val="25"/>
-        </w:rPr>
-        <w:t>• Luật Phòng cháy, chữa cháy và cứu nạn, cứu hộ số 55/2024/QH15 và các văn bản hướng dẫn thi hành còn hiệu lực.</w:t>
-      </w:r>
-    </w:p>
-    <w:p>
-      <w:pPr>
-        <w:pStyle w:val="Clause"/>
-        <w:jc w:val="both"/>
-      </w:pPr>
-      <w:r>
-        <w:rPr>
-          <w:rFonts w:ascii="Times New Roman" w:hAnsi="Times New Roman"/>
+          <w:rFonts w:ascii="Times New Roman" w:hAnsi="Times New Roman" w:eastAsia="Times New Roman"/>
           <w:b w:val="0"/>
           <w:i w:val="0"/>
-          <w:sz w:val="26"/>
+          <w:sz w:val="24"/>
         </w:rPr>
-        <w:t xml:space="preserve">Trên cơ sở nhu cầu thuê, khả năng cho thuê và sự tự nguyện của các bên, ngày </w:t>
+        <w:t xml:space="preserve">Số: </w:t>
       </w:r>
       <w:r>
         <w:rPr>
-          <w:rFonts w:ascii="Times New Roman" w:hAnsi="Times New Roman"/>
+          <w:rFonts w:ascii="Times New Roman" w:hAnsi="Times New Roman" w:eastAsia="Times New Roman"/>
+          <w:b/>
+          <w:i w:val="0"/>
+          <w:sz w:val="24"/>
+        </w:rPr>
+        <w:t>{{contract.number}}</w:t>
+      </w:r>
+      <w:r>
+        <w:rPr>
+          <w:rFonts w:ascii="Times New Roman" w:hAnsi="Times New Roman" w:eastAsia="Times New Roman"/>
           <w:b w:val="0"/>
           <w:i w:val="0"/>
-          <w:sz w:val="26"/>
+          <w:sz w:val="24"/>
+        </w:rPr>
+        <w:t xml:space="preserve"> - Ngày ký: </w:t>
+      </w:r>
+      <w:r>
+        <w:rPr>
+          <w:rFonts w:ascii="Times New Roman" w:hAnsi="Times New Roman" w:eastAsia="Times New Roman"/>
+          <w:b w:val="0"/>
+          <w:i w:val="0"/>
+          <w:sz w:val="24"/>
         </w:rPr>
         <w:t>{{contract.signingDate}}</w:t>
       </w:r>
       <w:r>
         <w:rPr>
-          <w:rFonts w:ascii="Times New Roman" w:hAnsi="Times New Roman"/>
+          <w:rFonts w:ascii="Times New Roman" w:hAnsi="Times New Roman" w:eastAsia="Times New Roman"/>
           <w:b w:val="0"/>
           <w:i w:val="0"/>
-          <w:sz w:val="26"/>
+          <w:sz w:val="24"/>
         </w:rPr>
         <w:t xml:space="preserve"> tại </w:t>
       </w:r>
       <w:r>
         <w:rPr>
-          <w:rFonts w:ascii="Times New Roman" w:hAnsi="Times New Roman"/>
+          <w:rFonts w:ascii="Times New Roman" w:hAnsi="Times New Roman" w:eastAsia="Times New Roman"/>
+          <w:b w:val="0"/>
+          <w:i w:val="0"/>
+          <w:sz w:val="24"/>
+        </w:rPr>
+        <w:t>{{contract.signingCity}}</w:t>
+      </w:r>
+    </w:p>
+    <w:p>
+      <w:pPr>
+        <w:keepNext/>
+        <w:spacing w:before="100" w:after="60"/>
+      </w:pPr>
+      <w:r>
+        <w:rPr>
+          <w:rFonts w:ascii="Times New Roman" w:hAnsi="Times New Roman" w:eastAsia="Times New Roman"/>
+          <w:b/>
+          <w:i w:val="0"/>
+          <w:sz w:val="26"/>
+        </w:rPr>
+        <w:t>CĂN CỨ PHÁP LÝ</w:t>
+      </w:r>
+    </w:p>
+    <w:p>
+      <w:pPr>
+        <w:spacing w:after="30" w:line="264" w:lineRule="auto"/>
+        <w:ind w:left="312" w:hanging="170"/>
+      </w:pPr>
+      <w:r>
+        <w:rPr>
+          <w:rFonts w:ascii="Times New Roman" w:hAnsi="Times New Roman" w:eastAsia="Times New Roman"/>
           <w:b w:val="0"/>
           <w:i w:val="0"/>
           <w:sz w:val="26"/>
         </w:rPr>
-        <w:t>{{contract.signingCity}}</w:t>
+        <w:t>• Bộ luật Dân sự số 91/2015/QH13;</w:t>
       </w:r>
+    </w:p>
+    <w:p>
+      <w:pPr>
+        <w:spacing w:after="30" w:line="264" w:lineRule="auto"/>
+        <w:ind w:left="312" w:hanging="170"/>
+      </w:pPr>
       <w:r>
         <w:rPr>
-          <w:rFonts w:ascii="Times New Roman" w:hAnsi="Times New Roman"/>
+          <w:rFonts w:ascii="Times New Roman" w:hAnsi="Times New Roman" w:eastAsia="Times New Roman"/>
           <w:b w:val="0"/>
           <w:i w:val="0"/>
           <w:sz w:val="26"/>
         </w:rPr>
-        <w:t>, các bên thống nhất giao kết Hợp đồng với các điều khoản sau:</w:t>
+        <w:t>• Luật Nhà ở số 27/2023/QH15 và quy định về quản lý nhà ở nhiều phòng cho thuê;</w:t>
       </w:r>
     </w:p>
     <w:p>
       <w:pPr>
-        <w:spacing w:before="80" w:after="60"/>
+        <w:spacing w:after="30" w:line="264" w:lineRule="auto"/>
+        <w:ind w:left="312" w:hanging="170"/>
       </w:pPr>
       <w:r>
         <w:rPr>
-          <w:rFonts w:ascii="Times New Roman" w:hAnsi="Times New Roman"/>
-          <w:b/>
+          <w:rFonts w:ascii="Times New Roman" w:hAnsi="Times New Roman" w:eastAsia="Times New Roman"/>
+          <w:b w:val="0"/>
+          <w:i w:val="0"/>
           <w:sz w:val="26"/>
         </w:rPr>
-        <w:t>BÊN CHO THUÊ (BÊN A)</w:t>
-      </w:r>
-    </w:p>
-    <w:tbl>
-      <w:tblPr>
-        <w:tblW w:type="auto" w:w="0"/>
-        <w:jc w:val="center"/>
-        <w:tblLayout w:type="fixed"/>
-        <w:tblLook w:firstColumn="1" w:firstRow="1" w:lastColumn="0" w:lastRow="0" w:noHBand="0" w:noVBand="1" w:val="04A0"/>
-        <w:tblBorders>
-          <w:top w:val="single" w:sz="4" w:color="E5E5E5"/>
-          <w:left w:val="single" w:sz="4" w:color="E5E5E5"/>
-          <w:bottom w:val="single" w:sz="4" w:color="E5E5E5"/>
-          <w:right w:val="single" w:sz="4" w:color="E5E5E5"/>
-          <w:insideH w:val="single" w:sz="4" w:color="E5E5E5"/>
-          <w:insideV w:val="single" w:sz="4" w:color="E5E5E5"/>
-        </w:tblBorders>
-      </w:tblPr>
-      <w:tblGrid>
-        <w:gridCol w:w="2381"/>
-        <w:gridCol w:w="6803"/>
-      </w:tblGrid>
-      <w:tr>
-        <w:tc>
-          <w:tcPr>
-            <w:tcW w:type="dxa" w:w="2381"/>
-            <w:tcMar>
-              <w:top w:w="70" w:type="dxa"/>
-              <w:start w:w="90" w:type="dxa"/>
-              <w:bottom w:w="70" w:type="dxa"/>
-              <w:end w:w="90" w:type="dxa"/>
-            </w:tcMar>
-            <w:vAlign w:val="center"/>
-          </w:tcPr>
-          <w:p>
-            <w:pPr>
-              <w:spacing w:after="0"/>
-            </w:pPr>
-            <w:r>
-              <w:rPr>
-                <w:rFonts w:ascii="Times New Roman" w:hAnsi="Times New Roman"/>
-                <w:b/>
-                <w:sz w:val="25"/>
-              </w:rPr>
-              <w:t>Họ và tên</w:t>
-            </w:r>
-          </w:p>
-        </w:tc>
-        <w:tc>
-          <w:tcPr>
-            <w:tcW w:type="dxa" w:w="6803"/>
-            <w:tcMar>
-              <w:top w:w="70" w:type="dxa"/>
-              <w:start w:w="90" w:type="dxa"/>
-              <w:bottom w:w="70" w:type="dxa"/>
-              <w:end w:w="90" w:type="dxa"/>
-            </w:tcMar>
-            <w:vAlign w:val="center"/>
-          </w:tcPr>
-          <w:p>
-            <w:pPr>
-              <w:spacing w:after="0"/>
-            </w:pPr>
-            <w:r>
-              <w:rPr>
-                <w:rFonts w:ascii="Times New Roman" w:hAnsi="Times New Roman"/>
-                <w:sz w:val="25"/>
-              </w:rPr>
-              <w:t>{{landlord.fullName}}</w:t>
-            </w:r>
-          </w:p>
-        </w:tc>
-      </w:tr>
-      <w:tr>
-        <w:tc>
-          <w:tcPr>
-            <w:tcW w:type="dxa" w:w="2381"/>
-            <w:tcMar>
-              <w:top w:w="70" w:type="dxa"/>
-              <w:start w:w="90" w:type="dxa"/>
-              <w:bottom w:w="70" w:type="dxa"/>
-              <w:end w:w="90" w:type="dxa"/>
-            </w:tcMar>
-            <w:vAlign w:val="center"/>
-          </w:tcPr>
-          <w:p>
-            <w:pPr>
-              <w:spacing w:after="0"/>
-            </w:pPr>
-            <w:r>
-              <w:rPr>
-                <w:rFonts w:ascii="Times New Roman" w:hAnsi="Times New Roman"/>
-                <w:b/>
-                <w:sz w:val="25"/>
-              </w:rPr>
-              <w:t>CCCD/Mã số định danh</w:t>
-            </w:r>
-          </w:p>
-        </w:tc>
-        <w:tc>
-          <w:tcPr>
-            <w:tcW w:type="dxa" w:w="6803"/>
-            <w:tcMar>
-              <w:top w:w="70" w:type="dxa"/>
-              <w:start w:w="90" w:type="dxa"/>
-              <w:bottom w:w="70" w:type="dxa"/>
-              <w:end w:w="90" w:type="dxa"/>
-            </w:tcMar>
-            <w:vAlign w:val="center"/>
-          </w:tcPr>
-          <w:p>
-            <w:pPr>
-              <w:spacing w:after="0"/>
-            </w:pPr>
-            <w:r>
-              <w:rPr>
-                <w:rFonts w:ascii="Times New Roman" w:hAnsi="Times New Roman"/>
-                <w:sz w:val="25"/>
-              </w:rPr>
-              <w:t>{{landlord.idNumber}}</w:t>
-            </w:r>
-          </w:p>
-        </w:tc>
-      </w:tr>
-      <w:tr>
-        <w:tc>
-          <w:tcPr>
-            <w:tcW w:type="dxa" w:w="2381"/>
-            <w:tcMar>
-              <w:top w:w="70" w:type="dxa"/>
-              <w:start w:w="90" w:type="dxa"/>
-              <w:bottom w:w="70" w:type="dxa"/>
-              <w:end w:w="90" w:type="dxa"/>
-            </w:tcMar>
-            <w:vAlign w:val="center"/>
-          </w:tcPr>
-          <w:p>
-            <w:pPr>
-              <w:spacing w:after="0"/>
-            </w:pPr>
-            <w:r>
-              <w:rPr>
-                <w:rFonts w:ascii="Times New Roman" w:hAnsi="Times New Roman"/>
-                <w:b/>
-                <w:sz w:val="25"/>
-              </w:rPr>
-              <w:t>Nơi thường trú</w:t>
-            </w:r>
-          </w:p>
-        </w:tc>
-        <w:tc>
-          <w:tcPr>
-            <w:tcW w:type="dxa" w:w="6803"/>
-            <w:tcMar>
-              <w:top w:w="70" w:type="dxa"/>
-              <w:start w:w="90" w:type="dxa"/>
-              <w:bottom w:w="70" w:type="dxa"/>
-              <w:end w:w="90" w:type="dxa"/>
-            </w:tcMar>
-            <w:vAlign w:val="center"/>
-          </w:tcPr>
-          <w:p>
-            <w:pPr>
-              <w:spacing w:after="0"/>
-            </w:pPr>
-            <w:r>
-              <w:rPr>
-                <w:rFonts w:ascii="Times New Roman" w:hAnsi="Times New Roman"/>
-                <w:sz w:val="25"/>
-              </w:rPr>
-              <w:t>{{landlord.permanentAddress}}</w:t>
-            </w:r>
-          </w:p>
-        </w:tc>
-      </w:tr>
-      <w:tr>
-        <w:tc>
-          <w:tcPr>
-            <w:tcW w:type="dxa" w:w="2381"/>
-            <w:tcMar>
-              <w:top w:w="70" w:type="dxa"/>
-              <w:start w:w="90" w:type="dxa"/>
-              <w:bottom w:w="70" w:type="dxa"/>
-              <w:end w:w="90" w:type="dxa"/>
-            </w:tcMar>
-            <w:vAlign w:val="center"/>
-          </w:tcPr>
-          <w:p>
-            <w:pPr>
-              <w:spacing w:after="0"/>
-            </w:pPr>
-            <w:r>
-              <w:rPr>
-                <w:rFonts w:ascii="Times New Roman" w:hAnsi="Times New Roman"/>
-                <w:b/>
-                <w:sz w:val="25"/>
-              </w:rPr>
-              <w:t>Điện thoại</w:t>
-            </w:r>
-          </w:p>
-        </w:tc>
-        <w:tc>
-          <w:tcPr>
-            <w:tcW w:type="dxa" w:w="6803"/>
-            <w:tcMar>
-              <w:top w:w="70" w:type="dxa"/>
-              <w:start w:w="90" w:type="dxa"/>
-              <w:bottom w:w="70" w:type="dxa"/>
-              <w:end w:w="90" w:type="dxa"/>
-            </w:tcMar>
-            <w:vAlign w:val="center"/>
-          </w:tcPr>
-          <w:p>
-            <w:pPr>
-              <w:spacing w:after="0"/>
-            </w:pPr>
-            <w:r>
-              <w:rPr>
-                <w:rFonts w:ascii="Times New Roman" w:hAnsi="Times New Roman"/>
-                <w:sz w:val="25"/>
-              </w:rPr>
-              <w:t>{{landlord.phone}}</w:t>
-            </w:r>
-          </w:p>
-        </w:tc>
-      </w:tr>
-      <w:tr>
-        <w:tc>
-          <w:tcPr>
-            <w:tcW w:type="dxa" w:w="2381"/>
-            <w:tcMar>
-              <w:top w:w="70" w:type="dxa"/>
-              <w:start w:w="90" w:type="dxa"/>
-              <w:bottom w:w="70" w:type="dxa"/>
-              <w:end w:w="90" w:type="dxa"/>
-            </w:tcMar>
-            <w:vAlign w:val="center"/>
-          </w:tcPr>
-          <w:p>
-            <w:pPr>
-              <w:spacing w:after="0"/>
-            </w:pPr>
-            <w:r>
-              <w:rPr>
-                <w:rFonts w:ascii="Times New Roman" w:hAnsi="Times New Roman"/>
-                <w:b/>
-                <w:sz w:val="25"/>
-              </w:rPr>
-              <w:t>Email</w:t>
-            </w:r>
-          </w:p>
-        </w:tc>
-        <w:tc>
-          <w:tcPr>
-            <w:tcW w:type="dxa" w:w="6803"/>
-            <w:tcMar>
-              <w:top w:w="70" w:type="dxa"/>
-              <w:start w:w="90" w:type="dxa"/>
-              <w:bottom w:w="70" w:type="dxa"/>
-              <w:end w:w="90" w:type="dxa"/>
-            </w:tcMar>
-            <w:vAlign w:val="center"/>
-          </w:tcPr>
-          <w:p>
-            <w:pPr>
-              <w:spacing w:after="0"/>
-            </w:pPr>
-            <w:r>
-              <w:rPr>
-                <w:rFonts w:ascii="Times New Roman" w:hAnsi="Times New Roman"/>
-                <w:sz w:val="25"/>
-              </w:rPr>
-              <w:t>{{landlord.email}}</w:t>
-            </w:r>
-          </w:p>
-        </w:tc>
-      </w:tr>
-    </w:tbl>
-    <w:p>
-      <w:pPr>
-        <w:spacing w:before="80" w:after="60"/>
-      </w:pPr>
-      <w:r>
-        <w:rPr>
-          <w:rFonts w:ascii="Times New Roman" w:hAnsi="Times New Roman"/>
-          <w:b/>
-          <w:sz w:val="26"/>
-        </w:rPr>
-        <w:t>BÊN THUÊ (BÊN B)</w:t>
-      </w:r>
-    </w:p>
-    <w:tbl>
-      <w:tblPr>
-        <w:tblW w:type="auto" w:w="0"/>
-        <w:jc w:val="center"/>
-        <w:tblLayout w:type="fixed"/>
-        <w:tblLook w:firstColumn="1" w:firstRow="1" w:lastColumn="0" w:lastRow="0" w:noHBand="0" w:noVBand="1" w:val="04A0"/>
-        <w:tblBorders>
-          <w:top w:val="single" w:sz="4" w:color="E5E5E5"/>
-          <w:left w:val="single" w:sz="4" w:color="E5E5E5"/>
-          <w:bottom w:val="single" w:sz="4" w:color="E5E5E5"/>
-          <w:right w:val="single" w:sz="4" w:color="E5E5E5"/>
-          <w:insideH w:val="single" w:sz="4" w:color="E5E5E5"/>
-          <w:insideV w:val="single" w:sz="4" w:color="E5E5E5"/>
-        </w:tblBorders>
-      </w:tblPr>
-      <w:tblGrid>
-        <w:gridCol w:w="2381"/>
-        <w:gridCol w:w="6803"/>
-      </w:tblGrid>
-      <w:tr>
-        <w:tc>
-          <w:tcPr>
-            <w:tcW w:type="dxa" w:w="2381"/>
-            <w:tcMar>
-              <w:top w:w="70" w:type="dxa"/>
-              <w:start w:w="90" w:type="dxa"/>
-              <w:bottom w:w="70" w:type="dxa"/>
-              <w:end w:w="90" w:type="dxa"/>
-            </w:tcMar>
-            <w:vAlign w:val="center"/>
-          </w:tcPr>
-          <w:p>
-            <w:pPr>
-              <w:spacing w:after="0"/>
-            </w:pPr>
-            <w:r>
-              <w:rPr>
-                <w:rFonts w:ascii="Times New Roman" w:hAnsi="Times New Roman"/>
-                <w:b/>
-                <w:sz w:val="25"/>
-              </w:rPr>
-              <w:t>Họ và tên</w:t>
-            </w:r>
-          </w:p>
-        </w:tc>
-        <w:tc>
-          <w:tcPr>
-            <w:tcW w:type="dxa" w:w="6803"/>
-            <w:tcMar>
-              <w:top w:w="70" w:type="dxa"/>
-              <w:start w:w="90" w:type="dxa"/>
-              <w:bottom w:w="70" w:type="dxa"/>
-              <w:end w:w="90" w:type="dxa"/>
-            </w:tcMar>
-            <w:vAlign w:val="center"/>
-          </w:tcPr>
-          <w:p>
-            <w:pPr>
-              <w:spacing w:after="0"/>
-            </w:pPr>
-            <w:r>
-              <w:rPr>
-                <w:rFonts w:ascii="Times New Roman" w:hAnsi="Times New Roman"/>
-                <w:sz w:val="25"/>
-              </w:rPr>
-              <w:t>{{tenant.fullName}}</w:t>
-            </w:r>
-          </w:p>
-        </w:tc>
-      </w:tr>
-      <w:tr>
-        <w:tc>
-          <w:tcPr>
-            <w:tcW w:type="dxa" w:w="2381"/>
-            <w:tcMar>
-              <w:top w:w="70" w:type="dxa"/>
-              <w:start w:w="90" w:type="dxa"/>
-              <w:bottom w:w="70" w:type="dxa"/>
-              <w:end w:w="90" w:type="dxa"/>
-            </w:tcMar>
-            <w:vAlign w:val="center"/>
-          </w:tcPr>
-          <w:p>
-            <w:pPr>
-              <w:spacing w:after="0"/>
-            </w:pPr>
-            <w:r>
-              <w:rPr>
-                <w:rFonts w:ascii="Times New Roman" w:hAnsi="Times New Roman"/>
-                <w:b/>
-                <w:sz w:val="25"/>
-              </w:rPr>
-              <w:t>CCCD/Mã số định danh</w:t>
-            </w:r>
-          </w:p>
-        </w:tc>
-        <w:tc>
-          <w:tcPr>
-            <w:tcW w:type="dxa" w:w="6803"/>
-            <w:tcMar>
-              <w:top w:w="70" w:type="dxa"/>
-              <w:start w:w="90" w:type="dxa"/>
-              <w:bottom w:w="70" w:type="dxa"/>
-              <w:end w:w="90" w:type="dxa"/>
-            </w:tcMar>
-            <w:vAlign w:val="center"/>
-          </w:tcPr>
-          <w:p>
-            <w:pPr>
-              <w:spacing w:after="0"/>
-            </w:pPr>
-            <w:r>
-              <w:rPr>
-                <w:rFonts w:ascii="Times New Roman" w:hAnsi="Times New Roman"/>
-                <w:sz w:val="25"/>
-              </w:rPr>
-              <w:t>{{tenant.idNumber}}</w:t>
-            </w:r>
-          </w:p>
-        </w:tc>
-      </w:tr>
-      <w:tr>
-        <w:tc>
-          <w:tcPr>
-            <w:tcW w:type="dxa" w:w="2381"/>
-            <w:tcMar>
-              <w:top w:w="70" w:type="dxa"/>
-              <w:start w:w="90" w:type="dxa"/>
-              <w:bottom w:w="70" w:type="dxa"/>
-              <w:end w:w="90" w:type="dxa"/>
-            </w:tcMar>
-            <w:vAlign w:val="center"/>
-          </w:tcPr>
-          <w:p>
-            <w:pPr>
-              <w:spacing w:after="0"/>
-            </w:pPr>
-            <w:r>
-              <w:rPr>
-                <w:rFonts w:ascii="Times New Roman" w:hAnsi="Times New Roman"/>
-                <w:b/>
-                <w:sz w:val="25"/>
-              </w:rPr>
-              <w:t>Nơi thường trú</w:t>
-            </w:r>
-          </w:p>
-        </w:tc>
-        <w:tc>
-          <w:tcPr>
-            <w:tcW w:type="dxa" w:w="6803"/>
-            <w:tcMar>
-              <w:top w:w="70" w:type="dxa"/>
-              <w:start w:w="90" w:type="dxa"/>
-              <w:bottom w:w="70" w:type="dxa"/>
-              <w:end w:w="90" w:type="dxa"/>
-            </w:tcMar>
-            <w:vAlign w:val="center"/>
-          </w:tcPr>
-          <w:p>
-            <w:pPr>
-              <w:spacing w:after="0"/>
-            </w:pPr>
-            <w:r>
-              <w:rPr>
-                <w:rFonts w:ascii="Times New Roman" w:hAnsi="Times New Roman"/>
-                <w:sz w:val="25"/>
-              </w:rPr>
-              <w:t>{{tenant.permanentAddress}}</w:t>
-            </w:r>
-          </w:p>
-        </w:tc>
-      </w:tr>
-      <w:tr>
-        <w:tc>
-          <w:tcPr>
-            <w:tcW w:type="dxa" w:w="2381"/>
-            <w:tcMar>
-              <w:top w:w="70" w:type="dxa"/>
-              <w:start w:w="90" w:type="dxa"/>
-              <w:bottom w:w="70" w:type="dxa"/>
-              <w:end w:w="90" w:type="dxa"/>
-            </w:tcMar>
-            <w:vAlign w:val="center"/>
-          </w:tcPr>
-          <w:p>
-            <w:pPr>
-              <w:spacing w:after="0"/>
-            </w:pPr>
-            <w:r>
-              <w:rPr>
-                <w:rFonts w:ascii="Times New Roman" w:hAnsi="Times New Roman"/>
-                <w:b/>
-                <w:sz w:val="25"/>
-              </w:rPr>
-              <w:t>Điện thoại</w:t>
-            </w:r>
-          </w:p>
-        </w:tc>
-        <w:tc>
-          <w:tcPr>
-            <w:tcW w:type="dxa" w:w="6803"/>
-            <w:tcMar>
-              <w:top w:w="70" w:type="dxa"/>
-              <w:start w:w="90" w:type="dxa"/>
-              <w:bottom w:w="70" w:type="dxa"/>
-              <w:end w:w="90" w:type="dxa"/>
-            </w:tcMar>
-            <w:vAlign w:val="center"/>
-          </w:tcPr>
-          <w:p>
-            <w:pPr>
-              <w:spacing w:after="0"/>
-            </w:pPr>
-            <w:r>
-              <w:rPr>
-                <w:rFonts w:ascii="Times New Roman" w:hAnsi="Times New Roman"/>
-                <w:sz w:val="25"/>
-              </w:rPr>
-              <w:t>{{tenant.phone}}</w:t>
-            </w:r>
-          </w:p>
-        </w:tc>
-      </w:tr>
-      <w:tr>
-        <w:tc>
-          <w:tcPr>
-            <w:tcW w:type="dxa" w:w="2381"/>
-            <w:tcMar>
-              <w:top w:w="70" w:type="dxa"/>
-              <w:start w:w="90" w:type="dxa"/>
-              <w:bottom w:w="70" w:type="dxa"/>
-              <w:end w:w="90" w:type="dxa"/>
-            </w:tcMar>
-            <w:vAlign w:val="center"/>
-          </w:tcPr>
-          <w:p>
-            <w:pPr>
-              <w:spacing w:after="0"/>
-            </w:pPr>
-            <w:r>
-              <w:rPr>
-                <w:rFonts w:ascii="Times New Roman" w:hAnsi="Times New Roman"/>
-                <w:b/>
-                <w:sz w:val="25"/>
-              </w:rPr>
-              <w:t>Email</w:t>
-            </w:r>
-          </w:p>
-        </w:tc>
-        <w:tc>
-          <w:tcPr>
-            <w:tcW w:type="dxa" w:w="6803"/>
-            <w:tcMar>
-              <w:top w:w="70" w:type="dxa"/>
-              <w:start w:w="90" w:type="dxa"/>
-              <w:bottom w:w="70" w:type="dxa"/>
-              <w:end w:w="90" w:type="dxa"/>
-            </w:tcMar>
-            <w:vAlign w:val="center"/>
-          </w:tcPr>
-          <w:p>
-            <w:pPr>
-              <w:spacing w:after="0"/>
-            </w:pPr>
-            <w:r>
-              <w:rPr>
-                <w:rFonts w:ascii="Times New Roman" w:hAnsi="Times New Roman"/>
-                <w:sz w:val="25"/>
-              </w:rPr>
-              <w:t>{{tenant.email}}</w:t>
-            </w:r>
-          </w:p>
-        </w:tc>
-      </w:tr>
-      <w:tr>
-        <w:tc>
-          <w:tcPr>
-            <w:tcW w:type="dxa" w:w="2381"/>
-            <w:tcMar>
-              <w:top w:w="70" w:type="dxa"/>
-              <w:start w:w="90" w:type="dxa"/>
-              <w:bottom w:w="70" w:type="dxa"/>
-              <w:end w:w="90" w:type="dxa"/>
-            </w:tcMar>
-            <w:vAlign w:val="center"/>
-          </w:tcPr>
-          <w:p>
-            <w:pPr>
-              <w:spacing w:after="0"/>
-            </w:pPr>
-            <w:r>
-              <w:rPr>
-                <w:rFonts w:ascii="Times New Roman" w:hAnsi="Times New Roman"/>
-                <w:b/>
-                <w:sz w:val="25"/>
-              </w:rPr>
-              <w:t>Số người ở</w:t>
-            </w:r>
-          </w:p>
-        </w:tc>
-        <w:tc>
-          <w:tcPr>
-            <w:tcW w:type="dxa" w:w="6803"/>
-            <w:tcMar>
-              <w:top w:w="70" w:type="dxa"/>
-              <w:start w:w="90" w:type="dxa"/>
-              <w:bottom w:w="70" w:type="dxa"/>
-              <w:end w:w="90" w:type="dxa"/>
-            </w:tcMar>
-            <w:vAlign w:val="center"/>
-          </w:tcPr>
-          <w:p>
-            <w:pPr>
-              <w:spacing w:after="0"/>
-            </w:pPr>
-            <w:r>
-              <w:rPr>
-                <w:rFonts w:ascii="Times New Roman" w:hAnsi="Times New Roman"/>
-                <w:sz w:val="25"/>
-              </w:rPr>
-              <w:t>{{tenant.occupantCount}}</w:t>
-            </w:r>
-          </w:p>
-        </w:tc>
-      </w:tr>
-    </w:tbl>
-    <w:p>
-      <w:pPr>
-        <w:pStyle w:val="Article"/>
-      </w:pPr>
-      <w:r>
-        <w:t>ĐIỀU 1. PHÒNG TRỌ VÀ MỤC ĐÍCH THUÊ</w:t>
+        <w:t>• Luật Giao dịch điện tử số 20/2023/QH15;</w:t>
       </w:r>
     </w:p>
     <w:p>
       <w:pPr>
-        <w:pStyle w:val="Clause"/>
-        <w:jc w:val="both"/>
+        <w:spacing w:after="30" w:line="264" w:lineRule="auto"/>
+        <w:ind w:left="312" w:hanging="170"/>
       </w:pPr>
       <w:r>
         <w:rPr>
-          <w:rFonts w:ascii="Times New Roman" w:hAnsi="Times New Roman"/>
+          <w:rFonts w:ascii="Times New Roman" w:hAnsi="Times New Roman" w:eastAsia="Times New Roman"/>
+          <w:b w:val="0"/>
+          <w:i w:val="0"/>
+          <w:sz w:val="26"/>
+        </w:rPr>
+        <w:t>• Luật Cư trú số 68/2020/QH14;</w:t>
+      </w:r>
+    </w:p>
+    <w:p>
+      <w:pPr>
+        <w:spacing w:after="30" w:line="264" w:lineRule="auto"/>
+        <w:ind w:left="312" w:hanging="170"/>
+      </w:pPr>
+      <w:r>
+        <w:rPr>
+          <w:rFonts w:ascii="Times New Roman" w:hAnsi="Times New Roman" w:eastAsia="Times New Roman"/>
+          <w:b w:val="0"/>
+          <w:i w:val="0"/>
+          <w:sz w:val="26"/>
+        </w:rPr>
+        <w:t>• Luật Phòng cháy, chữa cháy và cứu nạn, cứu hộ số 55/2024/QH15 (quy định về nhà trọ và lối thoát nạn khẩn cấp);</w:t>
+      </w:r>
+    </w:p>
+    <w:p>
+      <w:pPr>
+        <w:spacing w:after="30" w:line="264" w:lineRule="auto"/>
+        <w:ind w:left="312" w:hanging="170"/>
+      </w:pPr>
+      <w:r>
+        <w:rPr>
+          <w:rFonts w:ascii="Times New Roman" w:hAnsi="Times New Roman" w:eastAsia="Times New Roman"/>
+          <w:b w:val="0"/>
+          <w:i w:val="0"/>
+          <w:sz w:val="26"/>
+        </w:rPr>
+        <w:t>• Luật Kinh doanh bất động sản số 29/2023/QH15 (trong phạm vi áp dụng).</w:t>
+      </w:r>
+    </w:p>
+    <w:p>
+      <w:pPr>
+        <w:keepNext/>
+        <w:spacing w:before="100" w:after="60"/>
+      </w:pPr>
+      <w:r>
+        <w:rPr>
+          <w:rFonts w:ascii="Times New Roman" w:hAnsi="Times New Roman" w:eastAsia="Times New Roman"/>
           <w:b/>
           <w:i w:val="0"/>
           <w:sz w:val="26"/>
         </w:rPr>
-        <w:t xml:space="preserve">1.1. </w:t>
+        <w:t>THÔNG TIN CÁC BÊN</w:t>
+      </w:r>
+    </w:p>
+    <w:p>
+      <w:pPr>
+        <w:keepNext w:val="0"/>
+        <w:spacing w:before="0" w:after="40" w:line="276" w:lineRule="auto"/>
+      </w:pPr>
+      <w:r>
+        <w:rPr>
+          <w:rFonts w:ascii="Times New Roman" w:hAnsi="Times New Roman" w:eastAsia="Times New Roman"/>
+          <w:b/>
+          <w:i w:val="0"/>
+          <w:sz w:val="26"/>
+        </w:rPr>
+        <w:t xml:space="preserve">BÊN CHO THUÊ (BÊN A): </w:t>
       </w:r>
       <w:r>
         <w:rPr>
-          <w:rFonts w:ascii="Times New Roman" w:hAnsi="Times New Roman"/>
+          <w:rFonts w:ascii="Times New Roman" w:hAnsi="Times New Roman" w:eastAsia="Times New Roman"/>
+          <w:b/>
+          <w:i w:val="0"/>
+          <w:sz w:val="26"/>
+        </w:rPr>
+        <w:t>{{landlord.fullName}}</w:t>
+      </w:r>
+    </w:p>
+    <w:p>
+      <w:pPr>
+        <w:keepNext w:val="0"/>
+        <w:spacing w:before="0" w:after="40" w:line="276" w:lineRule="auto"/>
+      </w:pPr>
+      <w:r>
+        <w:rPr>
+          <w:rFonts w:ascii="Times New Roman" w:hAnsi="Times New Roman" w:eastAsia="Times New Roman"/>
           <w:b w:val="0"/>
           <w:i w:val="0"/>
           <w:sz w:val="26"/>
         </w:rPr>
-        <w:t xml:space="preserve">Bên A đồng ý cho Bên B thuê phòng trọ số </w:t>
+        <w:t xml:space="preserve">CCCD/Hộ chiếu: </w:t>
       </w:r>
       <w:r>
         <w:rPr>
-          <w:rFonts w:ascii="Times New Roman" w:hAnsi="Times New Roman"/>
+          <w:rFonts w:ascii="Times New Roman" w:hAnsi="Times New Roman" w:eastAsia="Times New Roman"/>
+          <w:b w:val="0"/>
+          <w:i w:val="0"/>
+          <w:sz w:val="26"/>
+        </w:rPr>
+        <w:t>{{landlord.idNumber}}</w:t>
+      </w:r>
+      <w:r>
+        <w:rPr>
+          <w:rFonts w:ascii="Times New Roman" w:hAnsi="Times New Roman" w:eastAsia="Times New Roman"/>
+          <w:b w:val="0"/>
+          <w:i w:val="0"/>
+          <w:sz w:val="26"/>
+        </w:rPr>
+        <w:t xml:space="preserve">; Thường trú: </w:t>
+      </w:r>
+      <w:r>
+        <w:rPr>
+          <w:rFonts w:ascii="Times New Roman" w:hAnsi="Times New Roman" w:eastAsia="Times New Roman"/>
+          <w:b w:val="0"/>
+          <w:i w:val="0"/>
+          <w:sz w:val="26"/>
+        </w:rPr>
+        <w:t>{{landlord.permanentAddress}}</w:t>
+      </w:r>
+    </w:p>
+    <w:p>
+      <w:pPr>
+        <w:keepNext w:val="0"/>
+        <w:spacing w:before="0" w:after="40" w:line="276" w:lineRule="auto"/>
+      </w:pPr>
+      <w:r>
+        <w:rPr>
+          <w:rFonts w:ascii="Times New Roman" w:hAnsi="Times New Roman" w:eastAsia="Times New Roman"/>
+          <w:b w:val="0"/>
+          <w:i w:val="0"/>
+          <w:sz w:val="26"/>
+        </w:rPr>
+        <w:t xml:space="preserve">Điện thoại: </w:t>
+      </w:r>
+      <w:r>
+        <w:rPr>
+          <w:rFonts w:ascii="Times New Roman" w:hAnsi="Times New Roman" w:eastAsia="Times New Roman"/>
+          <w:b w:val="0"/>
+          <w:i w:val="0"/>
+          <w:sz w:val="26"/>
+        </w:rPr>
+        <w:t>{{landlord.phone}}</w:t>
+      </w:r>
+      <w:r>
+        <w:rPr>
+          <w:rFonts w:ascii="Times New Roman" w:hAnsi="Times New Roman" w:eastAsia="Times New Roman"/>
+          <w:b w:val="0"/>
+          <w:i w:val="0"/>
+          <w:sz w:val="26"/>
+        </w:rPr>
+        <w:t xml:space="preserve">; Email: </w:t>
+      </w:r>
+      <w:r>
+        <w:rPr>
+          <w:rFonts w:ascii="Times New Roman" w:hAnsi="Times New Roman" w:eastAsia="Times New Roman"/>
+          <w:b w:val="0"/>
+          <w:i w:val="0"/>
+          <w:sz w:val="26"/>
+        </w:rPr>
+        <w:t>{{landlord.email}}</w:t>
+      </w:r>
+    </w:p>
+    <w:p>
+      <w:pPr>
+        <w:keepNext w:val="0"/>
+        <w:spacing w:before="0" w:after="40" w:line="276" w:lineRule="auto"/>
+      </w:pPr>
+      <w:r>
+        <w:rPr>
+          <w:rFonts w:ascii="Times New Roman" w:hAnsi="Times New Roman" w:eastAsia="Times New Roman"/>
+          <w:b/>
+          <w:i w:val="0"/>
+          <w:sz w:val="26"/>
+        </w:rPr>
+        <w:t xml:space="preserve">BÊN THUÊ (BÊN B): </w:t>
+      </w:r>
+      <w:r>
+        <w:rPr>
+          <w:rFonts w:ascii="Times New Roman" w:hAnsi="Times New Roman" w:eastAsia="Times New Roman"/>
+          <w:b/>
+          <w:i w:val="0"/>
+          <w:sz w:val="26"/>
+        </w:rPr>
+        <w:t>{{tenant.fullName}}</w:t>
+      </w:r>
+    </w:p>
+    <w:p>
+      <w:pPr>
+        <w:keepNext w:val="0"/>
+        <w:spacing w:before="0" w:after="40" w:line="276" w:lineRule="auto"/>
+      </w:pPr>
+      <w:r>
+        <w:rPr>
+          <w:rFonts w:ascii="Times New Roman" w:hAnsi="Times New Roman" w:eastAsia="Times New Roman"/>
+          <w:b w:val="0"/>
+          <w:i w:val="0"/>
+          <w:sz w:val="26"/>
+        </w:rPr>
+        <w:t xml:space="preserve">CCCD/Hộ chiếu: </w:t>
+      </w:r>
+      <w:r>
+        <w:rPr>
+          <w:rFonts w:ascii="Times New Roman" w:hAnsi="Times New Roman" w:eastAsia="Times New Roman"/>
+          <w:b w:val="0"/>
+          <w:i w:val="0"/>
+          <w:sz w:val="26"/>
+        </w:rPr>
+        <w:t>{{tenant.idNumber}}</w:t>
+      </w:r>
+      <w:r>
+        <w:rPr>
+          <w:rFonts w:ascii="Times New Roman" w:hAnsi="Times New Roman" w:eastAsia="Times New Roman"/>
+          <w:b w:val="0"/>
+          <w:i w:val="0"/>
+          <w:sz w:val="26"/>
+        </w:rPr>
+        <w:t xml:space="preserve">; Thường trú: </w:t>
+      </w:r>
+      <w:r>
+        <w:rPr>
+          <w:rFonts w:ascii="Times New Roman" w:hAnsi="Times New Roman" w:eastAsia="Times New Roman"/>
+          <w:b w:val="0"/>
+          <w:i w:val="0"/>
+          <w:sz w:val="26"/>
+        </w:rPr>
+        <w:t>{{tenant.permanentAddress}}</w:t>
+      </w:r>
+    </w:p>
+    <w:p>
+      <w:pPr>
+        <w:keepNext w:val="0"/>
+        <w:spacing w:before="0" w:after="40" w:line="276" w:lineRule="auto"/>
+      </w:pPr>
+      <w:r>
+        <w:rPr>
+          <w:rFonts w:ascii="Times New Roman" w:hAnsi="Times New Roman" w:eastAsia="Times New Roman"/>
+          <w:b w:val="0"/>
+          <w:i w:val="0"/>
+          <w:sz w:val="26"/>
+        </w:rPr>
+        <w:t xml:space="preserve">Điện thoại: </w:t>
+      </w:r>
+      <w:r>
+        <w:rPr>
+          <w:rFonts w:ascii="Times New Roman" w:hAnsi="Times New Roman" w:eastAsia="Times New Roman"/>
+          <w:b w:val="0"/>
+          <w:i w:val="0"/>
+          <w:sz w:val="26"/>
+        </w:rPr>
+        <w:t>{{tenant.phone}}</w:t>
+      </w:r>
+      <w:r>
+        <w:rPr>
+          <w:rFonts w:ascii="Times New Roman" w:hAnsi="Times New Roman" w:eastAsia="Times New Roman"/>
+          <w:b w:val="0"/>
+          <w:i w:val="0"/>
+          <w:sz w:val="26"/>
+        </w:rPr>
+        <w:t xml:space="preserve">; Email: </w:t>
+      </w:r>
+      <w:r>
+        <w:rPr>
+          <w:rFonts w:ascii="Times New Roman" w:hAnsi="Times New Roman" w:eastAsia="Times New Roman"/>
+          <w:b w:val="0"/>
+          <w:i w:val="0"/>
+          <w:sz w:val="26"/>
+        </w:rPr>
+        <w:t>{{tenant.email}}</w:t>
+      </w:r>
+    </w:p>
+    <w:p>
+      <w:pPr>
+        <w:keepNext w:val="0"/>
+        <w:spacing w:before="0" w:after="40" w:line="276" w:lineRule="auto"/>
+      </w:pPr>
+      <w:r>
+        <w:rPr>
+          <w:rFonts w:ascii="Times New Roman" w:hAnsi="Times New Roman" w:eastAsia="Times New Roman"/>
+          <w:b w:val="0"/>
+          <w:i w:val="0"/>
+          <w:sz w:val="26"/>
+        </w:rPr>
+        <w:t xml:space="preserve">Số người cư trú đăng ký: </w:t>
+      </w:r>
+      <w:r>
+        <w:rPr>
+          <w:rFonts w:ascii="Times New Roman" w:hAnsi="Times New Roman" w:eastAsia="Times New Roman"/>
+          <w:b w:val="0"/>
+          <w:i w:val="0"/>
+          <w:sz w:val="26"/>
+        </w:rPr>
+        <w:t>{{tenant.occupantCount}}</w:t>
+      </w:r>
+      <w:r>
+        <w:rPr>
+          <w:rFonts w:ascii="Times New Roman" w:hAnsi="Times New Roman" w:eastAsia="Times New Roman"/>
+          <w:b w:val="0"/>
+          <w:i w:val="0"/>
+          <w:sz w:val="26"/>
+        </w:rPr>
+        <w:t xml:space="preserve">; Xe máy đăng ký: </w:t>
+      </w:r>
+      <w:r>
+        <w:rPr>
+          <w:rFonts w:ascii="Times New Roman" w:hAnsi="Times New Roman" w:eastAsia="Times New Roman"/>
+          <w:b w:val="0"/>
+          <w:i w:val="0"/>
+          <w:sz w:val="26"/>
+        </w:rPr>
+        <w:t>{{tenant.motorbikeCount}}</w:t>
+      </w:r>
+      <w:r>
+        <w:rPr>
+          <w:rFonts w:ascii="Times New Roman" w:hAnsi="Times New Roman" w:eastAsia="Times New Roman"/>
+          <w:b w:val="0"/>
+          <w:i w:val="0"/>
+          <w:sz w:val="26"/>
+        </w:rPr>
+        <w:t xml:space="preserve">; Ô tô đăng ký: </w:t>
+      </w:r>
+      <w:r>
+        <w:rPr>
+          <w:rFonts w:ascii="Times New Roman" w:hAnsi="Times New Roman" w:eastAsia="Times New Roman"/>
+          <w:b w:val="0"/>
+          <w:i w:val="0"/>
+          <w:sz w:val="26"/>
+        </w:rPr>
+        <w:t>{{tenant.carCount}}</w:t>
+      </w:r>
+    </w:p>
+    <w:p>
+      <w:pPr>
+        <w:keepNext/>
+        <w:spacing w:before="100" w:after="60"/>
+      </w:pPr>
+      <w:r>
+        <w:rPr>
+          <w:rFonts w:ascii="Times New Roman" w:hAnsi="Times New Roman" w:eastAsia="Times New Roman"/>
+          <w:b/>
+          <w:i w:val="0"/>
+          <w:sz w:val="26"/>
+        </w:rPr>
+        <w:t>ĐIỀU 1. ĐỐI TƯỢNG VÀ ĐẶC ĐIỂM PHÒNG TRỌ</w:t>
+      </w:r>
+    </w:p>
+    <w:p>
+      <w:pPr>
+        <w:keepNext w:val="0"/>
+        <w:spacing w:before="0" w:after="40" w:line="276" w:lineRule="auto"/>
+      </w:pPr>
+      <w:r>
+        <w:rPr>
+          <w:rFonts w:ascii="Times New Roman" w:hAnsi="Times New Roman" w:eastAsia="Times New Roman"/>
+          <w:b w:val="0"/>
+          <w:i w:val="0"/>
+          <w:sz w:val="26"/>
+        </w:rPr>
+        <w:t xml:space="preserve">1.1. Bên A cho Bên B thuê phòng số: </w:t>
+      </w:r>
+      <w:r>
+        <w:rPr>
+          <w:rFonts w:ascii="Times New Roman" w:hAnsi="Times New Roman" w:eastAsia="Times New Roman"/>
           <w:b w:val="0"/>
           <w:i w:val="0"/>
           <w:sz w:val="26"/>
@@ -849,16 +543,16 @@
       </w:r>
       <w:r>
         <w:rPr>
-          <w:rFonts w:ascii="Times New Roman" w:hAnsi="Times New Roman"/>
+          <w:rFonts w:ascii="Times New Roman" w:hAnsi="Times New Roman" w:eastAsia="Times New Roman"/>
           <w:b w:val="0"/>
           <w:i w:val="0"/>
           <w:sz w:val="26"/>
         </w:rPr>
-        <w:t xml:space="preserve">, tầng </w:t>
+        <w:t xml:space="preserve">, tại tầng </w:t>
       </w:r>
       <w:r>
         <w:rPr>
-          <w:rFonts w:ascii="Times New Roman" w:hAnsi="Times New Roman"/>
+          <w:rFonts w:ascii="Times New Roman" w:hAnsi="Times New Roman" w:eastAsia="Times New Roman"/>
           <w:b w:val="0"/>
           <w:i w:val="0"/>
           <w:sz w:val="26"/>
@@ -867,16 +561,16 @@
       </w:r>
       <w:r>
         <w:rPr>
-          <w:rFonts w:ascii="Times New Roman" w:hAnsi="Times New Roman"/>
+          <w:rFonts w:ascii="Times New Roman" w:hAnsi="Times New Roman" w:eastAsia="Times New Roman"/>
           <w:b w:val="0"/>
           <w:i w:val="0"/>
           <w:sz w:val="26"/>
         </w:rPr>
-        <w:t xml:space="preserve">, tại </w:t>
+        <w:t xml:space="preserve">, thuộc địa chỉ: </w:t>
       </w:r>
       <w:r>
         <w:rPr>
-          <w:rFonts w:ascii="Times New Roman" w:hAnsi="Times New Roman"/>
+          <w:rFonts w:ascii="Times New Roman" w:hAnsi="Times New Roman" w:eastAsia="Times New Roman"/>
           <w:b w:val="0"/>
           <w:i w:val="0"/>
           <w:sz w:val="26"/>
@@ -885,43 +579,7 @@
       </w:r>
       <w:r>
         <w:rPr>
-          <w:rFonts w:ascii="Times New Roman" w:hAnsi="Times New Roman"/>
-          <w:b w:val="0"/>
-          <w:i w:val="0"/>
-          <w:sz w:val="26"/>
-        </w:rPr>
-        <w:t xml:space="preserve">; diện tích </w:t>
-      </w:r>
-      <w:r>
-        <w:rPr>
-          <w:rFonts w:ascii="Times New Roman" w:hAnsi="Times New Roman"/>
-          <w:b w:val="0"/>
-          <w:i w:val="0"/>
-          <w:sz w:val="26"/>
-        </w:rPr>
-        <w:t>{{property.areaText}}</w:t>
-      </w:r>
-      <w:r>
-        <w:rPr>
-          <w:rFonts w:ascii="Times New Roman" w:hAnsi="Times New Roman"/>
-          <w:b w:val="0"/>
-          <w:i w:val="0"/>
-          <w:sz w:val="26"/>
-        </w:rPr>
-        <w:t xml:space="preserve">; loại tài sản </w:t>
-      </w:r>
-      <w:r>
-        <w:rPr>
-          <w:rFonts w:ascii="Times New Roman" w:hAnsi="Times New Roman"/>
-          <w:b w:val="0"/>
-          <w:i w:val="0"/>
-          <w:sz w:val="26"/>
-        </w:rPr>
-        <w:t>{{property.propertyType}}</w:t>
-      </w:r>
-      <w:r>
-        <w:rPr>
-          <w:rFonts w:ascii="Times New Roman" w:hAnsi="Times New Roman"/>
+          <w:rFonts w:ascii="Times New Roman" w:hAnsi="Times New Roman" w:eastAsia="Times New Roman"/>
           <w:b w:val="0"/>
           <w:i w:val="0"/>
           <w:sz w:val="26"/>
@@ -931,221 +589,84 @@
     </w:p>
     <w:p>
       <w:pPr>
-        <w:pStyle w:val="Clause"/>
-        <w:jc w:val="both"/>
+        <w:keepNext w:val="0"/>
+        <w:spacing w:before="0" w:after="40" w:line="276" w:lineRule="auto"/>
       </w:pPr>
       <w:r>
         <w:rPr>
-          <w:rFonts w:ascii="Times New Roman" w:hAnsi="Times New Roman"/>
-          <w:b/>
-          <w:i w:val="0"/>
-          <w:sz w:val="26"/>
-        </w:rPr>
-        <w:t xml:space="preserve">1.2. </w:t>
-      </w:r>
-      <w:r>
-        <w:rPr>
-          <w:rFonts w:ascii="Times New Roman" w:hAnsi="Times New Roman"/>
+          <w:rFonts w:ascii="Times New Roman" w:hAnsi="Times New Roman" w:eastAsia="Times New Roman"/>
           <w:b w:val="0"/>
           <w:i w:val="0"/>
           <w:sz w:val="26"/>
         </w:rPr>
-        <w:t xml:space="preserve">Phòng được sử dụng cho mục đích ở hợp pháp, đúng công năng và nội quy cơ sở. Số người ở theo đăng ký là </w:t>
+        <w:t xml:space="preserve">1.2. Diện tích phòng: </w:t>
       </w:r>
       <w:r>
         <w:rPr>
-          <w:rFonts w:ascii="Times New Roman" w:hAnsi="Times New Roman"/>
+          <w:rFonts w:ascii="Times New Roman" w:hAnsi="Times New Roman" w:eastAsia="Times New Roman"/>
           <w:b w:val="0"/>
           <w:i w:val="0"/>
           <w:sz w:val="26"/>
         </w:rPr>
-        <w:t>{{tenant.occupantCount}}</w:t>
+        <w:t>{{property.areaText}}</w:t>
       </w:r>
       <w:r>
         <w:rPr>
-          <w:rFonts w:ascii="Times New Roman" w:hAnsi="Times New Roman"/>
+          <w:rFonts w:ascii="Times New Roman" w:hAnsi="Times New Roman" w:eastAsia="Times New Roman"/>
           <w:b w:val="0"/>
           <w:i w:val="0"/>
           <w:sz w:val="26"/>
         </w:rPr>
-        <w:t xml:space="preserve"> người; Bên B không được bố trí người ở vượt số lượng này khi chưa thông báo và đáp ứng yêu cầu về cư trú, an toàn của cơ sở.</w:t>
-      </w:r>
-    </w:p>
-    <w:p>
-      <w:pPr>
-        <w:pStyle w:val="Article"/>
-      </w:pPr>
-      <w:r>
-        <w:t>ĐIỀU 2. THỜI HẠN THUÊ VÀ BÀN GIAO</w:t>
-      </w:r>
-    </w:p>
-    <w:p>
-      <w:pPr>
-        <w:pStyle w:val="Clause"/>
-        <w:jc w:val="both"/>
-      </w:pPr>
-      <w:r>
-        <w:rPr>
-          <w:rFonts w:ascii="Times New Roman" w:hAnsi="Times New Roman"/>
-          <w:b/>
-          <w:i w:val="0"/>
-          <w:sz w:val="26"/>
-        </w:rPr>
-        <w:t xml:space="preserve">2.1. </w:t>
+        <w:t xml:space="preserve">; Loại tài sản: </w:t>
       </w:r>
       <w:r>
         <w:rPr>
-          <w:rFonts w:ascii="Times New Roman" w:hAnsi="Times New Roman"/>
+          <w:rFonts w:ascii="Times New Roman" w:hAnsi="Times New Roman" w:eastAsia="Times New Roman"/>
           <w:b w:val="0"/>
           <w:i w:val="0"/>
           <w:sz w:val="26"/>
         </w:rPr>
-        <w:t xml:space="preserve">Thời hạn thuê từ ngày </w:t>
+        <w:t>{{property.propertyType}}</w:t>
       </w:r>
       <w:r>
         <w:rPr>
-          <w:rFonts w:ascii="Times New Roman" w:hAnsi="Times New Roman"/>
+          <w:rFonts w:ascii="Times New Roman" w:hAnsi="Times New Roman" w:eastAsia="Times New Roman"/>
           <w:b w:val="0"/>
           <w:i w:val="0"/>
           <w:sz w:val="26"/>
         </w:rPr>
-        <w:t>{{lease.startDateText}}</w:t>
+        <w:t xml:space="preserve">; Phạm vi thuê: </w:t>
       </w:r>
       <w:r>
         <w:rPr>
-          <w:rFonts w:ascii="Times New Roman" w:hAnsi="Times New Roman"/>
+          <w:rFonts w:ascii="Times New Roman" w:hAnsi="Times New Roman" w:eastAsia="Times New Roman"/>
           <w:b w:val="0"/>
           <w:i w:val="0"/>
           <w:sz w:val="26"/>
         </w:rPr>
-        <w:t xml:space="preserve"> đến ngày </w:t>
+        <w:t>{{property.rentalScope}}</w:t>
       </w:r>
       <w:r>
         <w:rPr>
-          <w:rFonts w:ascii="Times New Roman" w:hAnsi="Times New Roman"/>
+          <w:rFonts w:ascii="Times New Roman" w:hAnsi="Times New Roman" w:eastAsia="Times New Roman"/>
           <w:b w:val="0"/>
           <w:i w:val="0"/>
           <w:sz w:val="26"/>
         </w:rPr>
-        <w:t>{{lease.endDateText}}</w:t>
+        <w:t xml:space="preserve">; Mã tin đăng: </w:t>
       </w:r>
       <w:r>
         <w:rPr>
-          <w:rFonts w:ascii="Times New Roman" w:hAnsi="Times New Roman"/>
+          <w:rFonts w:ascii="Times New Roman" w:hAnsi="Times New Roman" w:eastAsia="Times New Roman"/>
           <w:b w:val="0"/>
           <w:i w:val="0"/>
           <w:sz w:val="26"/>
         </w:rPr>
-        <w:t xml:space="preserve">, tương đương </w:t>
+        <w:t>{{property.listingCode}}</w:t>
       </w:r>
       <w:r>
         <w:rPr>
-          <w:rFonts w:ascii="Times New Roman" w:hAnsi="Times New Roman"/>
-          <w:b w:val="0"/>
-          <w:i w:val="0"/>
-          <w:sz w:val="26"/>
-        </w:rPr>
-        <w:t>{{lease.durationText}}</w:t>
-      </w:r>
-      <w:r>
-        <w:rPr>
-          <w:rFonts w:ascii="Times New Roman" w:hAnsi="Times New Roman"/>
-          <w:b w:val="0"/>
-          <w:i w:val="0"/>
-          <w:sz w:val="26"/>
-        </w:rPr>
-        <w:t xml:space="preserve"> và </w:t>
-      </w:r>
-      <w:r>
-        <w:rPr>
-          <w:rFonts w:ascii="Times New Roman" w:hAnsi="Times New Roman"/>
-          <w:b w:val="0"/>
-          <w:i w:val="0"/>
-          <w:sz w:val="26"/>
-        </w:rPr>
-        <w:t>{{lease.durationMonths}}</w:t>
-      </w:r>
-      <w:r>
-        <w:rPr>
-          <w:rFonts w:ascii="Times New Roman" w:hAnsi="Times New Roman"/>
-          <w:b w:val="0"/>
-          <w:i w:val="0"/>
-          <w:sz w:val="26"/>
-        </w:rPr>
-        <w:t xml:space="preserve"> tháng.</w:t>
-      </w:r>
-    </w:p>
-    <w:p>
-      <w:pPr>
-        <w:pStyle w:val="Clause"/>
-        <w:jc w:val="both"/>
-      </w:pPr>
-      <w:r>
-        <w:rPr>
-          <w:rFonts w:ascii="Times New Roman" w:hAnsi="Times New Roman"/>
-          <w:b/>
-          <w:i w:val="0"/>
-          <w:sz w:val="26"/>
-        </w:rPr>
-        <w:t xml:space="preserve">2.2. </w:t>
-      </w:r>
-      <w:r>
-        <w:rPr>
-          <w:rFonts w:ascii="Times New Roman" w:hAnsi="Times New Roman"/>
-          <w:b w:val="0"/>
-          <w:i w:val="0"/>
-          <w:sz w:val="26"/>
-        </w:rPr>
-        <w:t xml:space="preserve">Ngày bàn giao phòng: </w:t>
-      </w:r>
-      <w:r>
-        <w:rPr>
-          <w:rFonts w:ascii="Times New Roman" w:hAnsi="Times New Roman"/>
-          <w:b w:val="0"/>
-          <w:i w:val="0"/>
-          <w:sz w:val="26"/>
-        </w:rPr>
-        <w:t>{{lease.handoverDateText}}</w:t>
-      </w:r>
-      <w:r>
-        <w:rPr>
-          <w:rFonts w:ascii="Times New Roman" w:hAnsi="Times New Roman"/>
-          <w:b w:val="0"/>
-          <w:i w:val="0"/>
-          <w:sz w:val="26"/>
-        </w:rPr>
-        <w:t xml:space="preserve">. Chỉ số điện ban đầu: </w:t>
-      </w:r>
-      <w:r>
-        <w:rPr>
-          <w:rFonts w:ascii="Times New Roman" w:hAnsi="Times New Roman"/>
-          <w:b w:val="0"/>
-          <w:i w:val="0"/>
-          <w:sz w:val="26"/>
-        </w:rPr>
-        <w:t>{{meters.electricityInitial}}</w:t>
-      </w:r>
-      <w:r>
-        <w:rPr>
-          <w:rFonts w:ascii="Times New Roman" w:hAnsi="Times New Roman"/>
-          <w:b w:val="0"/>
-          <w:i w:val="0"/>
-          <w:sz w:val="26"/>
-        </w:rPr>
-        <w:t xml:space="preserve">; chỉ số nước ban đầu: </w:t>
-      </w:r>
-      <w:r>
-        <w:rPr>
-          <w:rFonts w:ascii="Times New Roman" w:hAnsi="Times New Roman"/>
-          <w:b w:val="0"/>
-          <w:i w:val="0"/>
-          <w:sz w:val="26"/>
-        </w:rPr>
-        <w:t>{{meters.waterInitial}}</w:t>
-      </w:r>
-      <w:r>
-        <w:rPr>
-          <w:rFonts w:ascii="Times New Roman" w:hAnsi="Times New Roman"/>
+          <w:rFonts w:ascii="Times New Roman" w:hAnsi="Times New Roman" w:eastAsia="Times New Roman"/>
           <w:b w:val="0"/>
           <w:i w:val="0"/>
           <w:sz w:val="26"/>
@@ -1155,38 +676,318 @@
     </w:p>
     <w:p>
       <w:pPr>
-        <w:pStyle w:val="Article"/>
+        <w:keepNext w:val="0"/>
+        <w:spacing w:before="0" w:after="40" w:line="276" w:lineRule="auto"/>
       </w:pPr>
       <w:r>
-        <w:t>ĐIỀU 3. TIỀN THUÊ, ĐẶT CỌC VÀ THANH TOÁN</w:t>
+        <w:rPr>
+          <w:rFonts w:ascii="Times New Roman" w:hAnsi="Times New Roman" w:eastAsia="Times New Roman"/>
+          <w:b w:val="0"/>
+          <w:i w:val="0"/>
+          <w:sz w:val="26"/>
+        </w:rPr>
+        <w:t xml:space="preserve">1.3. Số người tối đa: </w:t>
+      </w:r>
+      <w:r>
+        <w:rPr>
+          <w:rFonts w:ascii="Times New Roman" w:hAnsi="Times New Roman" w:eastAsia="Times New Roman"/>
+          <w:b w:val="0"/>
+          <w:i w:val="0"/>
+          <w:sz w:val="26"/>
+        </w:rPr>
+        <w:t>{{property.maxOccupants}}</w:t>
+      </w:r>
+      <w:r>
+        <w:rPr>
+          <w:rFonts w:ascii="Times New Roman" w:hAnsi="Times New Roman" w:eastAsia="Times New Roman"/>
+          <w:b w:val="0"/>
+          <w:i w:val="0"/>
+          <w:sz w:val="26"/>
+        </w:rPr>
+        <w:t xml:space="preserve">; Số xe tối đa: </w:t>
+      </w:r>
+      <w:r>
+        <w:rPr>
+          <w:rFonts w:ascii="Times New Roman" w:hAnsi="Times New Roman" w:eastAsia="Times New Roman"/>
+          <w:b w:val="0"/>
+          <w:i w:val="0"/>
+          <w:sz w:val="26"/>
+        </w:rPr>
+        <w:t>{{property.maxVehicles}}</w:t>
+      </w:r>
+      <w:r>
+        <w:rPr>
+          <w:rFonts w:ascii="Times New Roman" w:hAnsi="Times New Roman" w:eastAsia="Times New Roman"/>
+          <w:b w:val="0"/>
+          <w:i w:val="0"/>
+          <w:sz w:val="26"/>
+        </w:rPr>
+        <w:t>.</w:t>
       </w:r>
     </w:p>
     <w:p>
       <w:pPr>
-        <w:pStyle w:val="Clause"/>
+        <w:spacing w:after="20"/>
+      </w:pPr>
+      <w:r>
+        <w:rPr>
+          <w:rFonts w:ascii="Times New Roman" w:hAnsi="Times New Roman" w:eastAsia="Times New Roman"/>
+          <w:b/>
+          <w:i w:val="0"/>
+          <w:sz w:val="26"/>
+        </w:rPr>
+        <w:t>1.4. Bảng đặc điểm kỹ thuật và tiện nghi phòng:</w:t>
+      </w:r>
+    </w:p>
+    <w:p>
+      <w:pPr>
+        <w:spacing w:after="60"/>
+        <w:jc w:val="center"/>
+      </w:pPr>
+      <w:r>
+        <w:rPr>
+          <w:rFonts w:ascii="Times New Roman" w:hAnsi="Times New Roman" w:eastAsia="Times New Roman"/>
+          <w:b/>
+          <w:i w:val="0"/>
+          <w:sz w:val="26"/>
+        </w:rPr>
+        <w:t>{{#propertyFeaturesTable}}</w:t>
+      </w:r>
+    </w:p>
+    <w:p>
+      <w:pPr>
+        <w:spacing w:after="40" w:line="276" w:lineRule="auto"/>
+        <w:ind w:left="0"/>
         <w:jc w:val="both"/>
       </w:pPr>
       <w:r>
         <w:rPr>
-          <w:rFonts w:ascii="Times New Roman" w:hAnsi="Times New Roman"/>
+          <w:rFonts w:ascii="Times New Roman" w:hAnsi="Times New Roman" w:eastAsia="Times New Roman"/>
+          <w:b w:val="0"/>
+          <w:i w:val="0"/>
+          <w:sz w:val="26"/>
+        </w:rPr>
+        <w:t>1.5. Mục đích sử dụng: Để ở và sinh hoạt cá nhân, tuyệt đối không sử dụng làm kho chứa hàng nguy hiểm hoặc địa điểm hoạt động trái pháp luật.</w:t>
+      </w:r>
+    </w:p>
+    <w:p>
+      <w:pPr>
+        <w:keepNext/>
+        <w:spacing w:before="100" w:after="60"/>
+      </w:pPr>
+      <w:r>
+        <w:rPr>
+          <w:rFonts w:ascii="Times New Roman" w:hAnsi="Times New Roman" w:eastAsia="Times New Roman"/>
           <w:b/>
           <w:i w:val="0"/>
           <w:sz w:val="26"/>
         </w:rPr>
-        <w:t xml:space="preserve">3.1. </w:t>
+        <w:t>ĐIỀU 2. THỜI HẠN THUÊ VÀ NHẬN PHÒNG</w:t>
       </w:r>
+    </w:p>
+    <w:p>
+      <w:pPr>
+        <w:keepNext w:val="0"/>
+        <w:spacing w:before="0" w:after="40" w:line="276" w:lineRule="auto"/>
+      </w:pPr>
       <w:r>
         <w:rPr>
-          <w:rFonts w:ascii="Times New Roman" w:hAnsi="Times New Roman"/>
+          <w:rFonts w:ascii="Times New Roman" w:hAnsi="Times New Roman" w:eastAsia="Times New Roman"/>
           <w:b w:val="0"/>
           <w:i w:val="0"/>
           <w:sz w:val="26"/>
         </w:rPr>
-        <w:t xml:space="preserve">Tiền thuê: </w:t>
+        <w:t xml:space="preserve">2.1. Thời hạn thuê: </w:t>
       </w:r>
       <w:r>
         <w:rPr>
-          <w:rFonts w:ascii="Times New Roman" w:hAnsi="Times New Roman"/>
+          <w:rFonts w:ascii="Times New Roman" w:hAnsi="Times New Roman" w:eastAsia="Times New Roman"/>
+          <w:b w:val="0"/>
+          <w:i w:val="0"/>
+          <w:sz w:val="26"/>
+        </w:rPr>
+        <w:t>{{lease.durationText}}</w:t>
+      </w:r>
+      <w:r>
+        <w:rPr>
+          <w:rFonts w:ascii="Times New Roman" w:hAnsi="Times New Roman" w:eastAsia="Times New Roman"/>
+          <w:b w:val="0"/>
+          <w:i w:val="0"/>
+          <w:sz w:val="26"/>
+        </w:rPr>
+        <w:t xml:space="preserve"> (</w:t>
+      </w:r>
+      <w:r>
+        <w:rPr>
+          <w:rFonts w:ascii="Times New Roman" w:hAnsi="Times New Roman" w:eastAsia="Times New Roman"/>
+          <w:b w:val="0"/>
+          <w:i w:val="0"/>
+          <w:sz w:val="26"/>
+        </w:rPr>
+        <w:t>{{lease.durationMonths}}</w:t>
+      </w:r>
+      <w:r>
+        <w:rPr>
+          <w:rFonts w:ascii="Times New Roman" w:hAnsi="Times New Roman" w:eastAsia="Times New Roman"/>
+          <w:b w:val="0"/>
+          <w:i w:val="0"/>
+          <w:sz w:val="26"/>
+        </w:rPr>
+        <w:t xml:space="preserve"> tháng), từ ngày </w:t>
+      </w:r>
+      <w:r>
+        <w:rPr>
+          <w:rFonts w:ascii="Times New Roman" w:hAnsi="Times New Roman" w:eastAsia="Times New Roman"/>
+          <w:b w:val="0"/>
+          <w:i w:val="0"/>
+          <w:sz w:val="26"/>
+        </w:rPr>
+        <w:t>{{lease.startDateText}}</w:t>
+      </w:r>
+      <w:r>
+        <w:rPr>
+          <w:rFonts w:ascii="Times New Roman" w:hAnsi="Times New Roman" w:eastAsia="Times New Roman"/>
+          <w:b w:val="0"/>
+          <w:i w:val="0"/>
+          <w:sz w:val="26"/>
+        </w:rPr>
+        <w:t xml:space="preserve"> đến ngày </w:t>
+      </w:r>
+      <w:r>
+        <w:rPr>
+          <w:rFonts w:ascii="Times New Roman" w:hAnsi="Times New Roman" w:eastAsia="Times New Roman"/>
+          <w:b w:val="0"/>
+          <w:i w:val="0"/>
+          <w:sz w:val="26"/>
+        </w:rPr>
+        <w:t>{{lease.endDateText}}</w:t>
+      </w:r>
+      <w:r>
+        <w:rPr>
+          <w:rFonts w:ascii="Times New Roman" w:hAnsi="Times New Roman" w:eastAsia="Times New Roman"/>
+          <w:b w:val="0"/>
+          <w:i w:val="0"/>
+          <w:sz w:val="26"/>
+        </w:rPr>
+        <w:t>.</w:t>
+      </w:r>
+    </w:p>
+    <w:p>
+      <w:pPr>
+        <w:keepNext w:val="0"/>
+        <w:spacing w:before="0" w:after="40" w:line="276" w:lineRule="auto"/>
+      </w:pPr>
+      <w:r>
+        <w:rPr>
+          <w:rFonts w:ascii="Times New Roman" w:hAnsi="Times New Roman" w:eastAsia="Times New Roman"/>
+          <w:b w:val="0"/>
+          <w:i w:val="0"/>
+          <w:sz w:val="26"/>
+        </w:rPr>
+        <w:t xml:space="preserve">2.2. Ngày bàn giao nhận phòng: </w:t>
+      </w:r>
+      <w:r>
+        <w:rPr>
+          <w:rFonts w:ascii="Times New Roman" w:hAnsi="Times New Roman" w:eastAsia="Times New Roman"/>
+          <w:b w:val="0"/>
+          <w:i w:val="0"/>
+          <w:sz w:val="26"/>
+        </w:rPr>
+        <w:t>{{lease.handoverDateText}}</w:t>
+      </w:r>
+      <w:r>
+        <w:rPr>
+          <w:rFonts w:ascii="Times New Roman" w:hAnsi="Times New Roman" w:eastAsia="Times New Roman"/>
+          <w:b w:val="0"/>
+          <w:i w:val="0"/>
+          <w:sz w:val="26"/>
+        </w:rPr>
+        <w:t>.</w:t>
+      </w:r>
+    </w:p>
+    <w:p>
+      <w:pPr>
+        <w:keepNext w:val="0"/>
+        <w:spacing w:before="0" w:after="40" w:line="276" w:lineRule="auto"/>
+      </w:pPr>
+      <w:r>
+        <w:rPr>
+          <w:rFonts w:ascii="Times New Roman" w:hAnsi="Times New Roman" w:eastAsia="Times New Roman"/>
+          <w:b w:val="0"/>
+          <w:i w:val="0"/>
+          <w:sz w:val="26"/>
+        </w:rPr>
+        <w:t xml:space="preserve">2.3. Chỉ số công tơ điện lúc nhận phòng: </w:t>
+      </w:r>
+      <w:r>
+        <w:rPr>
+          <w:rFonts w:ascii="Times New Roman" w:hAnsi="Times New Roman" w:eastAsia="Times New Roman"/>
+          <w:b w:val="0"/>
+          <w:i w:val="0"/>
+          <w:sz w:val="26"/>
+        </w:rPr>
+        <w:t>{{meters.electricityInitial}}</w:t>
+      </w:r>
+      <w:r>
+        <w:rPr>
+          <w:rFonts w:ascii="Times New Roman" w:hAnsi="Times New Roman" w:eastAsia="Times New Roman"/>
+          <w:b w:val="0"/>
+          <w:i w:val="0"/>
+          <w:sz w:val="26"/>
+        </w:rPr>
+        <w:t xml:space="preserve">; chỉ số đồng hồ nước: </w:t>
+      </w:r>
+      <w:r>
+        <w:rPr>
+          <w:rFonts w:ascii="Times New Roman" w:hAnsi="Times New Roman" w:eastAsia="Times New Roman"/>
+          <w:b w:val="0"/>
+          <w:i w:val="0"/>
+          <w:sz w:val="26"/>
+        </w:rPr>
+        <w:t>{{meters.waterInitial}}</w:t>
+      </w:r>
+      <w:r>
+        <w:rPr>
+          <w:rFonts w:ascii="Times New Roman" w:hAnsi="Times New Roman" w:eastAsia="Times New Roman"/>
+          <w:b w:val="0"/>
+          <w:i w:val="0"/>
+          <w:sz w:val="26"/>
+        </w:rPr>
+        <w:t xml:space="preserve"> (nếu dùng đồng hồ riêng, hoặc cập nhật tại Biên bản bàn giao nhận phòng).</w:t>
+      </w:r>
+    </w:p>
+    <w:p>
+      <w:pPr>
+        <w:keepNext/>
+        <w:spacing w:before="100" w:after="60"/>
+      </w:pPr>
+      <w:r>
+        <w:rPr>
+          <w:rFonts w:ascii="Times New Roman" w:hAnsi="Times New Roman" w:eastAsia="Times New Roman"/>
+          <w:b/>
+          <w:i w:val="0"/>
+          <w:sz w:val="26"/>
+        </w:rPr>
+        <w:t>ĐIỀU 3. GIÁ THUÊ, TIỀN CỌC VÀ PHƯƠNG THỨC THANH TOÁN</w:t>
+      </w:r>
+    </w:p>
+    <w:p>
+      <w:pPr>
+        <w:keepNext w:val="0"/>
+        <w:spacing w:before="0" w:after="40" w:line="276" w:lineRule="auto"/>
+      </w:pPr>
+      <w:r>
+        <w:rPr>
+          <w:rFonts w:ascii="Times New Roman" w:hAnsi="Times New Roman" w:eastAsia="Times New Roman"/>
+          <w:b w:val="0"/>
+          <w:i w:val="0"/>
+          <w:sz w:val="26"/>
+        </w:rPr>
+        <w:t xml:space="preserve">3.1. Giá thuê phòng: </w:t>
+      </w:r>
+      <w:r>
+        <w:rPr>
+          <w:rFonts w:ascii="Times New Roman" w:hAnsi="Times New Roman" w:eastAsia="Times New Roman"/>
           <w:b w:val="0"/>
           <w:i w:val="0"/>
           <w:sz w:val="26"/>
@@ -1195,16 +996,16 @@
       </w:r>
       <w:r>
         <w:rPr>
-          <w:rFonts w:ascii="Times New Roman" w:hAnsi="Times New Roman"/>
+          <w:rFonts w:ascii="Times New Roman" w:hAnsi="Times New Roman" w:eastAsia="Times New Roman"/>
           <w:b w:val="0"/>
           <w:i w:val="0"/>
           <w:sz w:val="26"/>
         </w:rPr>
-        <w:t xml:space="preserve"> (bằng chữ: </w:t>
+        <w:t xml:space="preserve"> VNĐ/tháng (Bằng chữ: </w:t>
       </w:r>
       <w:r>
         <w:rPr>
-          <w:rFonts w:ascii="Times New Roman" w:hAnsi="Times New Roman"/>
+          <w:rFonts w:ascii="Times New Roman" w:hAnsi="Times New Roman" w:eastAsia="Times New Roman"/>
           <w:b w:val="0"/>
           <w:i w:val="0"/>
           <w:sz w:val="26"/>
@@ -1213,7 +1014,7 @@
       </w:r>
       <w:r>
         <w:rPr>
-          <w:rFonts w:ascii="Times New Roman" w:hAnsi="Times New Roman"/>
+          <w:rFonts w:ascii="Times New Roman" w:hAnsi="Times New Roman" w:eastAsia="Times New Roman"/>
           <w:b w:val="0"/>
           <w:i w:val="0"/>
           <w:sz w:val="26"/>
@@ -1223,30 +1024,21 @@
     </w:p>
     <w:p>
       <w:pPr>
-        <w:pStyle w:val="Clause"/>
-        <w:jc w:val="both"/>
+        <w:keepNext w:val="0"/>
+        <w:spacing w:before="0" w:after="40" w:line="276" w:lineRule="auto"/>
       </w:pPr>
       <w:r>
         <w:rPr>
-          <w:rFonts w:ascii="Times New Roman" w:hAnsi="Times New Roman"/>
-          <w:b/>
-          <w:i w:val="0"/>
-          <w:sz w:val="26"/>
-        </w:rPr>
-        <w:t xml:space="preserve">3.2. </w:t>
-      </w:r>
-      <w:r>
-        <w:rPr>
-          <w:rFonts w:ascii="Times New Roman" w:hAnsi="Times New Roman"/>
+          <w:rFonts w:ascii="Times New Roman" w:hAnsi="Times New Roman" w:eastAsia="Times New Roman"/>
           <w:b w:val="0"/>
           <w:i w:val="0"/>
           <w:sz w:val="26"/>
         </w:rPr>
-        <w:t xml:space="preserve">Chu kỳ thanh toán: </w:t>
+        <w:t xml:space="preserve">3.2. Chu kỳ thanh toán: </w:t>
       </w:r>
       <w:r>
         <w:rPr>
-          <w:rFonts w:ascii="Times New Roman" w:hAnsi="Times New Roman"/>
+          <w:rFonts w:ascii="Times New Roman" w:hAnsi="Times New Roman" w:eastAsia="Times New Roman"/>
           <w:b w:val="0"/>
           <w:i w:val="0"/>
           <w:sz w:val="26"/>
@@ -1255,16 +1047,16 @@
       </w:r>
       <w:r>
         <w:rPr>
-          <w:rFonts w:ascii="Times New Roman" w:hAnsi="Times New Roman"/>
+          <w:rFonts w:ascii="Times New Roman" w:hAnsi="Times New Roman" w:eastAsia="Times New Roman"/>
           <w:b w:val="0"/>
           <w:i w:val="0"/>
           <w:sz w:val="26"/>
         </w:rPr>
-        <w:t xml:space="preserve">; hạn thanh toán: </w:t>
+        <w:t xml:space="preserve">; Hạn thanh toán định kỳ: </w:t>
       </w:r>
       <w:r>
         <w:rPr>
-          <w:rFonts w:ascii="Times New Roman" w:hAnsi="Times New Roman"/>
+          <w:rFonts w:ascii="Times New Roman" w:hAnsi="Times New Roman" w:eastAsia="Times New Roman"/>
           <w:b w:val="0"/>
           <w:i w:val="0"/>
           <w:sz w:val="26"/>
@@ -1273,25 +1065,7 @@
       </w:r>
       <w:r>
         <w:rPr>
-          <w:rFonts w:ascii="Times New Roman" w:hAnsi="Times New Roman"/>
-          <w:b w:val="0"/>
-          <w:i w:val="0"/>
-          <w:sz w:val="26"/>
-        </w:rPr>
-        <w:t xml:space="preserve">; phương thức thanh toán: </w:t>
-      </w:r>
-      <w:r>
-        <w:rPr>
-          <w:rFonts w:ascii="Times New Roman" w:hAnsi="Times New Roman"/>
-          <w:b w:val="0"/>
-          <w:i w:val="0"/>
-          <w:sz w:val="26"/>
-        </w:rPr>
-        <w:t>{{rent.paymentMethod}}</w:t>
-      </w:r>
-      <w:r>
-        <w:rPr>
-          <w:rFonts w:ascii="Times New Roman" w:hAnsi="Times New Roman"/>
+          <w:rFonts w:ascii="Times New Roman" w:hAnsi="Times New Roman" w:eastAsia="Times New Roman"/>
           <w:b w:val="0"/>
           <w:i w:val="0"/>
           <w:sz w:val="26"/>
@@ -1301,54 +1075,54 @@
     </w:p>
     <w:p>
       <w:pPr>
-        <w:pStyle w:val="Clause"/>
-        <w:jc w:val="both"/>
+        <w:keepNext w:val="0"/>
+        <w:spacing w:before="0" w:after="40" w:line="276" w:lineRule="auto"/>
       </w:pPr>
       <w:r>
         <w:rPr>
-          <w:rFonts w:ascii="Times New Roman" w:hAnsi="Times New Roman"/>
-          <w:b/>
-          <w:i w:val="0"/>
-          <w:sz w:val="26"/>
-        </w:rPr>
-        <w:t xml:space="preserve">3.3. </w:t>
-      </w:r>
-      <w:r>
-        <w:rPr>
-          <w:rFonts w:ascii="Times New Roman" w:hAnsi="Times New Roman"/>
+          <w:rFonts w:ascii="Times New Roman" w:hAnsi="Times New Roman" w:eastAsia="Times New Roman"/>
           <w:b w:val="0"/>
           <w:i w:val="0"/>
           <w:sz w:val="26"/>
         </w:rPr>
-        <w:t>Tiền thuê và tiền đặt cọc được thanh toán trực tuyến qua HomeSpace; không ghi hoặc sử dụng thông tin tài khoản ngân hàng cá nhân của Bên A trong mẫu Hợp đồng này.</w:t>
+        <w:t xml:space="preserve">3.3. Phương thức thanh toán: </w:t>
+      </w:r>
+      <w:r>
+        <w:rPr>
+          <w:rFonts w:ascii="Times New Roman" w:hAnsi="Times New Roman" w:eastAsia="Times New Roman"/>
+          <w:b w:val="0"/>
+          <w:i w:val="0"/>
+          <w:sz w:val="26"/>
+        </w:rPr>
+        <w:t>{{rent.paymentMethod}}</w:t>
+      </w:r>
+      <w:r>
+        <w:rPr>
+          <w:rFonts w:ascii="Times New Roman" w:hAnsi="Times New Roman" w:eastAsia="Times New Roman"/>
+          <w:b w:val="0"/>
+          <w:i w:val="0"/>
+          <w:sz w:val="26"/>
+        </w:rPr>
+        <w:t xml:space="preserve"> qua nền tảng HomeSpace. Tiền thuê và tiền cọc không thanh toán trực tiếp vào tài khoản cá nhân của Bên A.</w:t>
       </w:r>
     </w:p>
     <w:p>
       <w:pPr>
-        <w:pStyle w:val="Clause"/>
-        <w:jc w:val="both"/>
+        <w:keepNext w:val="0"/>
+        <w:spacing w:before="0" w:after="40" w:line="276" w:lineRule="auto"/>
       </w:pPr>
       <w:r>
         <w:rPr>
-          <w:rFonts w:ascii="Times New Roman" w:hAnsi="Times New Roman"/>
-          <w:b/>
-          <w:i w:val="0"/>
-          <w:sz w:val="26"/>
-        </w:rPr>
-        <w:t xml:space="preserve">3.4. </w:t>
-      </w:r>
-      <w:r>
-        <w:rPr>
-          <w:rFonts w:ascii="Times New Roman" w:hAnsi="Times New Roman"/>
+          <w:rFonts w:ascii="Times New Roman" w:hAnsi="Times New Roman" w:eastAsia="Times New Roman"/>
           <w:b w:val="0"/>
           <w:i w:val="0"/>
           <w:sz w:val="26"/>
         </w:rPr>
-        <w:t xml:space="preserve">Tiền đặt cọc: </w:t>
+        <w:t xml:space="preserve">3.4. Tiền đặt cọc: </w:t>
       </w:r>
       <w:r>
         <w:rPr>
-          <w:rFonts w:ascii="Times New Roman" w:hAnsi="Times New Roman"/>
+          <w:rFonts w:ascii="Times New Roman" w:hAnsi="Times New Roman" w:eastAsia="Times New Roman"/>
           <w:b w:val="0"/>
           <w:i w:val="0"/>
           <w:sz w:val="26"/>
@@ -1357,16 +1131,16 @@
       </w:r>
       <w:r>
         <w:rPr>
-          <w:rFonts w:ascii="Times New Roman" w:hAnsi="Times New Roman"/>
+          <w:rFonts w:ascii="Times New Roman" w:hAnsi="Times New Roman" w:eastAsia="Times New Roman"/>
           <w:b w:val="0"/>
           <w:i w:val="0"/>
           <w:sz w:val="26"/>
         </w:rPr>
-        <w:t xml:space="preserve"> (bằng chữ: </w:t>
+        <w:t xml:space="preserve"> VNĐ (Bằng chữ: </w:t>
       </w:r>
       <w:r>
         <w:rPr>
-          <w:rFonts w:ascii="Times New Roman" w:hAnsi="Times New Roman"/>
+          <w:rFonts w:ascii="Times New Roman" w:hAnsi="Times New Roman" w:eastAsia="Times New Roman"/>
           <w:b w:val="0"/>
           <w:i w:val="0"/>
           <w:sz w:val="26"/>
@@ -1375,16 +1149,31 @@
       </w:r>
       <w:r>
         <w:rPr>
-          <w:rFonts w:ascii="Times New Roman" w:hAnsi="Times New Roman"/>
+          <w:rFonts w:ascii="Times New Roman" w:hAnsi="Times New Roman" w:eastAsia="Times New Roman"/>
           <w:b w:val="0"/>
           <w:i w:val="0"/>
           <w:sz w:val="26"/>
         </w:rPr>
-        <w:t xml:space="preserve">). Điều kiện hoàn trả, khấu trừ hoặc xử lý cọc: </w:t>
+        <w:t>).</w:t>
+      </w:r>
+    </w:p>
+    <w:p>
+      <w:pPr>
+        <w:keepNext w:val="0"/>
+        <w:spacing w:before="0" w:after="40" w:line="276" w:lineRule="auto"/>
+      </w:pPr>
+      <w:r>
+        <w:rPr>
+          <w:rFonts w:ascii="Times New Roman" w:hAnsi="Times New Roman" w:eastAsia="Times New Roman"/>
+          <w:b w:val="0"/>
+          <w:i w:val="0"/>
+          <w:sz w:val="26"/>
+        </w:rPr>
+        <w:t xml:space="preserve">3.5. Điều kiện hoàn trả/khấu trừ tiền cọc: </w:t>
       </w:r>
       <w:r>
         <w:rPr>
-          <w:rFonts w:ascii="Times New Roman" w:hAnsi="Times New Roman"/>
+          <w:rFonts w:ascii="Times New Roman" w:hAnsi="Times New Roman" w:eastAsia="Times New Roman"/>
           <w:b w:val="0"/>
           <w:i w:val="0"/>
           <w:sz w:val="26"/>
@@ -1393,7 +1182,7 @@
       </w:r>
       <w:r>
         <w:rPr>
-          <w:rFonts w:ascii="Times New Roman" w:hAnsi="Times New Roman"/>
+          <w:rFonts w:ascii="Times New Roman" w:hAnsi="Times New Roman" w:eastAsia="Times New Roman"/>
           <w:b w:val="0"/>
           <w:i w:val="0"/>
           <w:sz w:val="26"/>
@@ -1403,59 +1192,174 @@
     </w:p>
     <w:p>
       <w:pPr>
-        <w:pStyle w:val="Article"/>
+        <w:spacing w:after="40" w:line="276" w:lineRule="auto"/>
+        <w:jc w:val="both"/>
       </w:pPr>
       <w:r>
-        <w:t>ĐIỀU 4. PHÍ DỊCH VỤ VÀ TÀI SẢN BÀN GIAO</w:t>
+        <w:rPr>
+          <w:rFonts w:ascii="Times New Roman" w:hAnsi="Times New Roman" w:eastAsia="Times New Roman"/>
+          <w:b w:val="0"/>
+          <w:i w:val="0"/>
+          <w:sz w:val="26"/>
+        </w:rPr>
+        <w:t>3.6. Trước thời điểm ký hợp đồng, Bên B đã hoàn tất thanh toán khoản tiền ban đầu qua hệ thống HomeSpace theo thông tin tại Phụ lục thanh toán đính kèm.</w:t>
       </w:r>
     </w:p>
     <w:p>
       <w:pPr>
-        <w:pStyle w:val="Clause"/>
-        <w:jc w:val="both"/>
+        <w:spacing w:after="20"/>
       </w:pPr>
       <w:r>
         <w:rPr>
-          <w:rFonts w:ascii="Times New Roman" w:hAnsi="Times New Roman"/>
+          <w:rFonts w:ascii="Times New Roman" w:hAnsi="Times New Roman" w:eastAsia="Times New Roman"/>
           <w:b/>
           <w:i w:val="0"/>
           <w:sz w:val="26"/>
         </w:rPr>
-        <w:t xml:space="preserve">4.1. </w:t>
+        <w:t>Xác nhận thanh toán ban đầu:</w:t>
       </w:r>
+    </w:p>
+    <w:p>
+      <w:pPr>
+        <w:spacing w:after="60"/>
+        <w:jc w:val="center"/>
+      </w:pPr>
       <w:r>
         <w:rPr>
-          <w:rFonts w:ascii="Times New Roman" w:hAnsi="Times New Roman"/>
+          <w:rFonts w:ascii="Times New Roman" w:hAnsi="Times New Roman" w:eastAsia="Times New Roman"/>
+          <w:b/>
+          <w:i w:val="0"/>
+          <w:sz w:val="26"/>
+        </w:rPr>
+        <w:t>{{#initialPaymentTable}}</w:t>
+      </w:r>
+    </w:p>
+    <w:p>
+      <w:pPr>
+        <w:keepNext w:val="0"/>
+        <w:spacing w:before="0" w:after="40" w:line="276" w:lineRule="auto"/>
+      </w:pPr>
+      <w:r>
+        <w:rPr>
+          <w:rFonts w:ascii="Times New Roman" w:hAnsi="Times New Roman" w:eastAsia="Times New Roman"/>
           <w:b w:val="0"/>
           <w:i w:val="0"/>
           <w:sz w:val="26"/>
         </w:rPr>
-        <w:t>Điện, nước, internet, rác, giặt sấy, gửi xe và dịch vụ khác được thu theo bảng phí được công khai cho Bên B và phù hợp quy định pháp luật.</w:t>
+        <w:t xml:space="preserve">Mã giao dịch: </w:t>
+      </w:r>
+      <w:r>
+        <w:rPr>
+          <w:rFonts w:ascii="Times New Roman" w:hAnsi="Times New Roman" w:eastAsia="Times New Roman"/>
+          <w:b w:val="0"/>
+          <w:i w:val="0"/>
+          <w:sz w:val="26"/>
+        </w:rPr>
+        <w:t>{{payment.initial.transactionCode}}</w:t>
+      </w:r>
+      <w:r>
+        <w:rPr>
+          <w:rFonts w:ascii="Times New Roman" w:hAnsi="Times New Roman" w:eastAsia="Times New Roman"/>
+          <w:b w:val="0"/>
+          <w:i w:val="0"/>
+          <w:sz w:val="26"/>
+        </w:rPr>
+        <w:t xml:space="preserve">; hoàn tất lúc: </w:t>
+      </w:r>
+      <w:r>
+        <w:rPr>
+          <w:rFonts w:ascii="Times New Roman" w:hAnsi="Times New Roman" w:eastAsia="Times New Roman"/>
+          <w:b w:val="0"/>
+          <w:i w:val="0"/>
+          <w:sz w:val="26"/>
+        </w:rPr>
+        <w:t>{{payment.initial.paidAt}}</w:t>
+      </w:r>
+      <w:r>
+        <w:rPr>
+          <w:rFonts w:ascii="Times New Roman" w:hAnsi="Times New Roman" w:eastAsia="Times New Roman"/>
+          <w:b w:val="0"/>
+          <w:i w:val="0"/>
+          <w:sz w:val="26"/>
+        </w:rPr>
+        <w:t xml:space="preserve">; trạng thái: </w:t>
+      </w:r>
+      <w:r>
+        <w:rPr>
+          <w:rFonts w:ascii="Times New Roman" w:hAnsi="Times New Roman" w:eastAsia="Times New Roman"/>
+          <w:b w:val="0"/>
+          <w:i w:val="0"/>
+          <w:sz w:val="26"/>
+        </w:rPr>
+        <w:t>{{payment.initial.status}}</w:t>
+      </w:r>
+      <w:r>
+        <w:rPr>
+          <w:rFonts w:ascii="Times New Roman" w:hAnsi="Times New Roman" w:eastAsia="Times New Roman"/>
+          <w:b w:val="0"/>
+          <w:i w:val="0"/>
+          <w:sz w:val="26"/>
+        </w:rPr>
+        <w:t xml:space="preserve">; tổng tiền ban đầu: </w:t>
+      </w:r>
+      <w:r>
+        <w:rPr>
+          <w:rFonts w:ascii="Times New Roman" w:hAnsi="Times New Roman" w:eastAsia="Times New Roman"/>
+          <w:b w:val="0"/>
+          <w:i w:val="0"/>
+          <w:sz w:val="26"/>
+        </w:rPr>
+        <w:t>{{payment.initial.totalAmount}}</w:t>
+      </w:r>
+      <w:r>
+        <w:rPr>
+          <w:rFonts w:ascii="Times New Roman" w:hAnsi="Times New Roman" w:eastAsia="Times New Roman"/>
+          <w:b w:val="0"/>
+          <w:i w:val="0"/>
+          <w:sz w:val="26"/>
+        </w:rPr>
+        <w:t>.</w:t>
       </w:r>
     </w:p>
     <w:p>
       <w:pPr>
-        <w:pStyle w:val="Clause"/>
         <w:keepNext/>
+        <w:spacing w:before="100" w:after="60"/>
       </w:pPr>
       <w:r>
         <w:rPr>
-          <w:rFonts w:ascii="Times New Roman" w:hAnsi="Times New Roman"/>
+          <w:rFonts w:ascii="Times New Roman" w:hAnsi="Times New Roman" w:eastAsia="Times New Roman"/>
           <w:b/>
+          <w:i w:val="0"/>
           <w:sz w:val="26"/>
         </w:rPr>
-        <w:t>4.2. Bảng đơn giá điện, nước, internet, rác, giặt sấy và gửi xe</w:t>
+        <w:t>ĐIỀU 4. CÁC KHOẢN PHÍ DỊCH VỤ, ĐIỆN, NƯỚC VÀ GỬI XE</w:t>
       </w:r>
     </w:p>
     <w:p>
       <w:pPr>
-        <w:spacing w:before="40" w:after="40"/>
+        <w:spacing w:after="20"/>
+      </w:pPr>
+      <w:r>
+        <w:rPr>
+          <w:rFonts w:ascii="Times New Roman" w:hAnsi="Times New Roman" w:eastAsia="Times New Roman"/>
+          <w:b/>
+          <w:i w:val="0"/>
+          <w:sz w:val="26"/>
+        </w:rPr>
+        <w:t>4.1. Bảng đơn giá điện, nước, internet, rác, vệ sinh và gửi xe:</w:t>
+      </w:r>
+    </w:p>
+    <w:p>
+      <w:pPr>
+        <w:spacing w:after="60"/>
         <w:jc w:val="center"/>
       </w:pPr>
       <w:r>
         <w:rPr>
-          <w:rFonts w:ascii="Times New Roman" w:hAnsi="Times New Roman"/>
+          <w:rFonts w:ascii="Times New Roman" w:hAnsi="Times New Roman" w:eastAsia="Times New Roman"/>
           <w:b/>
+          <w:i w:val="0"/>
           <w:sz w:val="26"/>
         </w:rPr>
         <w:t>{{#chargesTable}}</w:t>
@@ -1463,41 +1367,88 @@
     </w:p>
     <w:p>
       <w:pPr>
-        <w:pStyle w:val="Clause"/>
-        <w:spacing w:after="80"/>
+        <w:spacing w:after="20"/>
       </w:pPr>
       <w:r>
         <w:rPr>
-          <w:rFonts w:ascii="Times New Roman" w:hAnsi="Times New Roman"/>
-          <w:i/>
-          <w:sz w:val="23"/>
+          <w:rFonts w:ascii="Times New Roman" w:hAnsi="Times New Roman" w:eastAsia="Times New Roman"/>
+          <w:b/>
+          <w:i w:val="0"/>
+          <w:sz w:val="26"/>
         </w:rPr>
-        <w:t>Bảng phí do HomeSpace tự sinh từ dữ liệu cấu hình của cơ sở.</w:t>
+        <w:t>4.2. Bảng tiện ích và quyền sử dụng không gian chung:</w:t>
       </w:r>
     </w:p>
     <w:p>
       <w:pPr>
-        <w:pStyle w:val="Clause"/>
-        <w:keepNext/>
+        <w:spacing w:after="60"/>
+        <w:jc w:val="center"/>
       </w:pPr>
       <w:r>
         <w:rPr>
-          <w:rFonts w:ascii="Times New Roman" w:hAnsi="Times New Roman"/>
+          <w:rFonts w:ascii="Times New Roman" w:hAnsi="Times New Roman" w:eastAsia="Times New Roman"/>
           <w:b/>
+          <w:i w:val="0"/>
           <w:sz w:val="26"/>
         </w:rPr>
-        <w:t>4.3. Bảng thiết bị và nội thất bàn giao</w:t>
+        <w:t>{{#amenitiesTable}}</w:t>
       </w:r>
     </w:p>
     <w:p>
       <w:pPr>
-        <w:spacing w:before="40" w:after="40"/>
+        <w:spacing w:after="40" w:line="276" w:lineRule="auto"/>
+        <w:ind w:left="0"/>
+        <w:jc w:val="both"/>
+      </w:pPr>
+      <w:r>
+        <w:rPr>
+          <w:rFonts w:ascii="Times New Roman" w:hAnsi="Times New Roman" w:eastAsia="Times New Roman"/>
+          <w:b w:val="0"/>
+          <w:i w:val="0"/>
+          <w:sz w:val="26"/>
+        </w:rPr>
+        <w:t>4.3. Đối với tiện ích dùng chung (khu giặt phơi, nhà để xe, lối đi chung nếu có), Bên B được quyền sử dụng theo nội quy nhà trọ, khung giờ và tình trạng vận hành thực tế, không cấu thành cam kết vận hành liên tục tuyệt đối.</w:t>
+      </w:r>
+    </w:p>
+    <w:p>
+      <w:pPr>
+        <w:keepNext/>
+        <w:spacing w:before="100" w:after="60"/>
+      </w:pPr>
+      <w:r>
+        <w:rPr>
+          <w:rFonts w:ascii="Times New Roman" w:hAnsi="Times New Roman" w:eastAsia="Times New Roman"/>
+          <w:b/>
+          <w:i w:val="0"/>
+          <w:sz w:val="26"/>
+        </w:rPr>
+        <w:t>ĐIỀU 5. TRANG THIẾT BỊ VÀ NỘI THẤT TRONG PHÒNG</w:t>
+      </w:r>
+    </w:p>
+    <w:p>
+      <w:pPr>
+        <w:spacing w:after="20"/>
+      </w:pPr>
+      <w:r>
+        <w:rPr>
+          <w:rFonts w:ascii="Times New Roman" w:hAnsi="Times New Roman" w:eastAsia="Times New Roman"/>
+          <w:b/>
+          <w:i w:val="0"/>
+          <w:sz w:val="26"/>
+        </w:rPr>
+        <w:t>5.1. Danh mục thiết bị bàn giao trong phòng:</w:t>
+      </w:r>
+    </w:p>
+    <w:p>
+      <w:pPr>
+        <w:spacing w:after="60"/>
         <w:jc w:val="center"/>
       </w:pPr>
       <w:r>
         <w:rPr>
-          <w:rFonts w:ascii="Times New Roman" w:hAnsi="Times New Roman"/>
+          <w:rFonts w:ascii="Times New Roman" w:hAnsi="Times New Roman" w:eastAsia="Times New Roman"/>
           <w:b/>
+          <w:i w:val="0"/>
           <w:sz w:val="26"/>
         </w:rPr>
         <w:t>{{#equipmentTable}}</w:t>
@@ -1505,228 +1456,99 @@
     </w:p>
     <w:p>
       <w:pPr>
-        <w:pStyle w:val="Clause"/>
-        <w:spacing w:after="80"/>
+        <w:spacing w:after="40" w:line="276" w:lineRule="auto"/>
+        <w:ind w:left="0"/>
+        <w:jc w:val="both"/>
       </w:pPr>
       <w:r>
         <w:rPr>
-          <w:rFonts w:ascii="Times New Roman" w:hAnsi="Times New Roman"/>
-          <w:i/>
-          <w:sz w:val="23"/>
+          <w:rFonts w:ascii="Times New Roman" w:hAnsi="Times New Roman" w:eastAsia="Times New Roman"/>
+          <w:b w:val="0"/>
+          <w:i w:val="0"/>
+          <w:sz w:val="26"/>
         </w:rPr>
-        <w:t>Danh mục là căn cứ đối chiếu khi trả phòng và xử lý hư hỏng.</w:t>
+        <w:t>5.2. Bên B có trách nhiệm sử dụng đúng tính năng, giữ gìn vệ sinh và đền bù nếu làm hư hỏng, mất mát.</w:t>
       </w:r>
     </w:p>
     <w:p>
       <w:pPr>
-        <w:pStyle w:val="Article"/>
+        <w:keepNext/>
+        <w:spacing w:before="100" w:after="60"/>
       </w:pPr>
       <w:r>
-        <w:t>ĐIỀU 5. QUYỀN VÀ NGHĨA VỤ CỦA BÊN A</w:t>
+        <w:rPr>
+          <w:rFonts w:ascii="Times New Roman" w:hAnsi="Times New Roman" w:eastAsia="Times New Roman"/>
+          <w:b/>
+          <w:i w:val="0"/>
+          <w:sz w:val="26"/>
+        </w:rPr>
+        <w:t>ĐIỀU 6. QUYỀN VÀ NGHĨA VỤ CỦA BÊN A</w:t>
       </w:r>
     </w:p>
     <w:p>
       <w:pPr>
-        <w:pStyle w:val="Clause"/>
+        <w:spacing w:after="40" w:line="276" w:lineRule="auto"/>
+        <w:ind w:left="0"/>
         <w:jc w:val="both"/>
       </w:pPr>
       <w:r>
         <w:rPr>
-          <w:rFonts w:ascii="Times New Roman" w:hAnsi="Times New Roman"/>
+          <w:rFonts w:ascii="Times New Roman" w:hAnsi="Times New Roman" w:eastAsia="Times New Roman"/>
+          <w:b w:val="0"/>
+          <w:i w:val="0"/>
+          <w:sz w:val="26"/>
+        </w:rPr>
+        <w:t>6.1. Giao phòng và tiện nghi đúng hiện trạng thỏa thuận.</w:t>
+      </w:r>
+    </w:p>
+    <w:p>
+      <w:pPr>
+        <w:spacing w:after="40" w:line="276" w:lineRule="auto"/>
+        <w:ind w:left="0"/>
+        <w:jc w:val="both"/>
+      </w:pPr>
+      <w:r>
+        <w:rPr>
+          <w:rFonts w:ascii="Times New Roman" w:hAnsi="Times New Roman" w:eastAsia="Times New Roman"/>
+          <w:b w:val="0"/>
+          <w:i w:val="0"/>
+          <w:sz w:val="26"/>
+        </w:rPr>
+        <w:t>6.2. Đăng ký tạm trú hoặc phối hợp thực hiện thủ tục tạm trú cho Bên B theo quy định Luật Cư trú; bảo đảm an ninh khu trọ và bảo trì hệ thống cấp thoát nước, điện tổng trong phạm vi trách nhiệm của mình.</w:t>
+      </w:r>
+    </w:p>
+    <w:p>
+      <w:pPr>
+        <w:keepNext/>
+        <w:spacing w:before="100" w:after="60"/>
+      </w:pPr>
+      <w:r>
+        <w:rPr>
+          <w:rFonts w:ascii="Times New Roman" w:hAnsi="Times New Roman" w:eastAsia="Times New Roman"/>
           <w:b/>
           <w:i w:val="0"/>
           <w:sz w:val="26"/>
         </w:rPr>
-        <w:t xml:space="preserve">5.1. </w:t>
+        <w:t>ĐIỀU 7. QUYỀN VÀ NGHĨA VỤ CỦA BÊN B (NỘI QUY VÀ AN TOÀN PCCC)</w:t>
       </w:r>
+    </w:p>
+    <w:p>
+      <w:pPr>
+        <w:keepNext w:val="0"/>
+        <w:spacing w:before="0" w:after="40" w:line="276" w:lineRule="auto"/>
+      </w:pPr>
       <w:r>
         <w:rPr>
-          <w:rFonts w:ascii="Times New Roman" w:hAnsi="Times New Roman"/>
+          <w:rFonts w:ascii="Times New Roman" w:hAnsi="Times New Roman" w:eastAsia="Times New Roman"/>
           <w:b w:val="0"/>
           <w:i w:val="0"/>
           <w:sz w:val="26"/>
         </w:rPr>
-        <w:t>Bàn giao phòng đủ điều kiện sử dụng theo thỏa thuận; duy trì các hệ thống dùng chung thuộc phạm vi quản lý của chủ cơ sở và thông báo nội quy cho Bên B.</w:t>
-      </w:r>
-    </w:p>
-    <w:p>
-      <w:pPr>
-        <w:pStyle w:val="Clause"/>
-        <w:jc w:val="both"/>
-      </w:pPr>
-      <w:r>
-        <w:rPr>
-          <w:rFonts w:ascii="Times New Roman" w:hAnsi="Times New Roman"/>
-          <w:b/>
-          <w:i w:val="0"/>
-          <w:sz w:val="26"/>
-        </w:rPr>
-        <w:t xml:space="preserve">5.2. </w:t>
+        <w:t xml:space="preserve">7.1. Cư trú đúng số người đăng ký: </w:t>
       </w:r>
       <w:r>
         <w:rPr>
-          <w:rFonts w:ascii="Times New Roman" w:hAnsi="Times New Roman"/>
-          <w:b w:val="0"/>
-          <w:i w:val="0"/>
-          <w:sz w:val="26"/>
-        </w:rPr>
-        <w:t>Thực hiện trách nhiệm PCCC của chủ sở hữu hoặc người quản lý theo loại hình, quy mô và quy định pháp luật; duy trì lối thoát nạn, phương tiện PCCC và điều kiện an toàn thuộc phạm vi trách nhiệm của mình.</w:t>
-      </w:r>
-    </w:p>
-    <w:p>
-      <w:pPr>
-        <w:pStyle w:val="Clause"/>
-        <w:jc w:val="both"/>
-      </w:pPr>
-      <w:r>
-        <w:rPr>
-          <w:rFonts w:ascii="Times New Roman" w:hAnsi="Times New Roman"/>
-          <w:b/>
-          <w:i w:val="0"/>
-          <w:sz w:val="26"/>
-        </w:rPr>
-        <w:t xml:space="preserve">5.3. </w:t>
-      </w:r>
-      <w:r>
-        <w:rPr>
-          <w:rFonts w:ascii="Times New Roman" w:hAnsi="Times New Roman"/>
-          <w:b w:val="0"/>
-          <w:i w:val="0"/>
-          <w:sz w:val="26"/>
-        </w:rPr>
-        <w:t>Phối hợp cung cấp thông tin, xác nhận hoặc giấy tờ thuộc trách nhiệm của chủ cơ sở để Bên B thực hiện đăng ký tạm trú, thông báo lưu trú theo pháp luật.</w:t>
-      </w:r>
-    </w:p>
-    <w:p>
-      <w:pPr>
-        <w:pStyle w:val="Clause"/>
-        <w:jc w:val="both"/>
-      </w:pPr>
-      <w:r>
-        <w:rPr>
-          <w:rFonts w:ascii="Times New Roman" w:hAnsi="Times New Roman"/>
-          <w:b/>
-          <w:i w:val="0"/>
-          <w:sz w:val="26"/>
-        </w:rPr>
-        <w:t xml:space="preserve">5.4. </w:t>
-      </w:r>
-      <w:r>
-        <w:rPr>
-          <w:rFonts w:ascii="Times New Roman" w:hAnsi="Times New Roman"/>
-          <w:b w:val="0"/>
-          <w:i w:val="0"/>
-          <w:sz w:val="26"/>
-        </w:rPr>
-        <w:t>Được kiểm tra phòng khi cần thiết sau khi thông báo trước hợp lý, trừ trường hợp khẩn cấp về cháy, điện, nước, an ninh hoặc nguy cơ gây thiệt hại.</w:t>
-      </w:r>
-    </w:p>
-    <w:p>
-      <w:pPr>
-        <w:pStyle w:val="Article"/>
-      </w:pPr>
-      <w:r>
-        <w:t>ĐIỀU 6. QUYỀN VÀ NGHĨA VỤ CỦA BÊN B</w:t>
-      </w:r>
-    </w:p>
-    <w:p>
-      <w:pPr>
-        <w:pStyle w:val="Clause"/>
-        <w:jc w:val="both"/>
-      </w:pPr>
-      <w:r>
-        <w:rPr>
-          <w:rFonts w:ascii="Times New Roman" w:hAnsi="Times New Roman"/>
-          <w:b/>
-          <w:i w:val="0"/>
-          <w:sz w:val="26"/>
-        </w:rPr>
-        <w:t xml:space="preserve">6.1. </w:t>
-      </w:r>
-      <w:r>
-        <w:rPr>
-          <w:rFonts w:ascii="Times New Roman" w:hAnsi="Times New Roman"/>
-          <w:b w:val="0"/>
-          <w:i w:val="0"/>
-          <w:sz w:val="26"/>
-        </w:rPr>
-        <w:t>Thanh toán đúng hạn; bảo quản phòng và tài sản; giữ vệ sinh khu vực riêng và khu vực sử dụng chung.</w:t>
-      </w:r>
-    </w:p>
-    <w:p>
-      <w:pPr>
-        <w:pStyle w:val="Clause"/>
-        <w:jc w:val="both"/>
-      </w:pPr>
-      <w:r>
-        <w:rPr>
-          <w:rFonts w:ascii="Times New Roman" w:hAnsi="Times New Roman"/>
-          <w:b/>
-          <w:i w:val="0"/>
-          <w:sz w:val="26"/>
-        </w:rPr>
-        <w:t xml:space="preserve">6.2. </w:t>
-      </w:r>
-      <w:r>
-        <w:rPr>
-          <w:rFonts w:ascii="Times New Roman" w:hAnsi="Times New Roman"/>
-          <w:b w:val="0"/>
-          <w:i w:val="0"/>
-          <w:sz w:val="26"/>
-        </w:rPr>
-        <w:t>Cung cấp đầy đủ, trung thực và kịp thời thông tin cần thiết để đăng ký tạm trú, thông báo lưu trú và quản lý cư trú theo trường hợp áp dụng.</w:t>
-      </w:r>
-    </w:p>
-    <w:p>
-      <w:pPr>
-        <w:pStyle w:val="Clause"/>
-        <w:jc w:val="both"/>
-      </w:pPr>
-      <w:r>
-        <w:rPr>
-          <w:rFonts w:ascii="Times New Roman" w:hAnsi="Times New Roman"/>
-          <w:b/>
-          <w:i w:val="0"/>
-          <w:sz w:val="26"/>
-        </w:rPr>
-        <w:t xml:space="preserve">6.3. </w:t>
-      </w:r>
-      <w:r>
-        <w:rPr>
-          <w:rFonts w:ascii="Times New Roman" w:hAnsi="Times New Roman"/>
-          <w:b w:val="0"/>
-          <w:i w:val="0"/>
-          <w:sz w:val="26"/>
-        </w:rPr>
-        <w:t>Khách ở lại qua đêm phải được quản lý theo nội quy hợp pháp của cơ sở; Bên B có trách nhiệm cung cấp thông tin cần thiết để thực hiện nghĩa vụ lưu trú theo quy định.</w:t>
-      </w:r>
-    </w:p>
-    <w:p>
-      <w:pPr>
-        <w:pStyle w:val="Clause"/>
-        <w:jc w:val="both"/>
-      </w:pPr>
-      <w:r>
-        <w:rPr>
-          <w:rFonts w:ascii="Times New Roman" w:hAnsi="Times New Roman"/>
-          <w:b/>
-          <w:i w:val="0"/>
-          <w:sz w:val="26"/>
-        </w:rPr>
-        <w:t xml:space="preserve">6.4. </w:t>
-      </w:r>
-      <w:r>
-        <w:rPr>
-          <w:rFonts w:ascii="Times New Roman" w:hAnsi="Times New Roman"/>
-          <w:b w:val="0"/>
-          <w:i w:val="0"/>
-          <w:sz w:val="26"/>
-        </w:rPr>
-        <w:t xml:space="preserve">Không tự ý cho thuê lại, chuyển nhượng quyền thuê hoặc đưa thêm người vào ở thường xuyên vượt quá </w:t>
-      </w:r>
-      <w:r>
-        <w:rPr>
-          <w:rFonts w:ascii="Times New Roman" w:hAnsi="Times New Roman"/>
+          <w:rFonts w:ascii="Times New Roman" w:hAnsi="Times New Roman" w:eastAsia="Times New Roman"/>
           <w:b w:val="0"/>
           <w:i w:val="0"/>
           <w:sz w:val="26"/>
@@ -1735,433 +1557,281 @@
       </w:r>
       <w:r>
         <w:rPr>
-          <w:rFonts w:ascii="Times New Roman" w:hAnsi="Times New Roman"/>
+          <w:rFonts w:ascii="Times New Roman" w:hAnsi="Times New Roman" w:eastAsia="Times New Roman"/>
           <w:b w:val="0"/>
           <w:i w:val="0"/>
           <w:sz w:val="26"/>
         </w:rPr>
-        <w:t xml:space="preserve"> người trái với thỏa thuận và quy định quản lý cư trú.</w:t>
+        <w:t xml:space="preserve"> người; giữ đúng số lượng xe: </w:t>
+      </w:r>
+      <w:r>
+        <w:rPr>
+          <w:rFonts w:ascii="Times New Roman" w:hAnsi="Times New Roman" w:eastAsia="Times New Roman"/>
+          <w:b w:val="0"/>
+          <w:i w:val="0"/>
+          <w:sz w:val="26"/>
+        </w:rPr>
+        <w:t>{{tenant.motorbikeCount}}</w:t>
+      </w:r>
+      <w:r>
+        <w:rPr>
+          <w:rFonts w:ascii="Times New Roman" w:hAnsi="Times New Roman" w:eastAsia="Times New Roman"/>
+          <w:b w:val="0"/>
+          <w:i w:val="0"/>
+          <w:sz w:val="26"/>
+        </w:rPr>
+        <w:t xml:space="preserve"> xe máy. Khách ở qua đêm phải báo trước với Bên A và đăng ký theo quy định.</w:t>
       </w:r>
     </w:p>
     <w:p>
       <w:pPr>
-        <w:pStyle w:val="Article"/>
+        <w:spacing w:after="40" w:line="276" w:lineRule="auto"/>
+        <w:ind w:left="0"/>
+        <w:jc w:val="both"/>
       </w:pPr>
       <w:r>
-        <w:t>ĐIỀU 7. PCCC, AN NINH TRẬT TỰ VÀ NỘI QUY PHÒNG TRỌ</w:t>
+        <w:rPr>
+          <w:rFonts w:ascii="Times New Roman" w:hAnsi="Times New Roman" w:eastAsia="Times New Roman"/>
+          <w:b w:val="0"/>
+          <w:i w:val="0"/>
+          <w:sz w:val="26"/>
+        </w:rPr>
+        <w:t>7.2. TUÂN THỦ NGHIÊM NGẶT PCCC: Không sạc pin/ắc quy xe điện qua đêm không có người trông coi; không đun nấu bằng bếp gas mini không bảo đảm an toàn; không che chắn hành lang, cầu thang thoát nạn.</w:t>
       </w:r>
     </w:p>
     <w:p>
       <w:pPr>
-        <w:pStyle w:val="Clause"/>
+        <w:spacing w:after="40" w:line="276" w:lineRule="auto"/>
+        <w:ind w:left="0"/>
         <w:jc w:val="both"/>
       </w:pPr>
       <w:r>
         <w:rPr>
-          <w:rFonts w:ascii="Times New Roman" w:hAnsi="Times New Roman"/>
-          <w:b/>
-          <w:i w:val="0"/>
-          <w:sz w:val="26"/>
-        </w:rPr>
-        <w:t xml:space="preserve">7.1. </w:t>
-      </w:r>
-      <w:r>
-        <w:rPr>
-          <w:rFonts w:ascii="Times New Roman" w:hAnsi="Times New Roman"/>
+          <w:rFonts w:ascii="Times New Roman" w:hAnsi="Times New Roman" w:eastAsia="Times New Roman"/>
           <w:b w:val="0"/>
           <w:i w:val="0"/>
           <w:sz w:val="26"/>
         </w:rPr>
-        <w:t>Không sạc pin xe đạp điện, xe máy điện trái quy định; không sạc qua đêm trong điều kiện không có người giám sát hoặc tại vị trí, nguồn điện không được phép theo yêu cầu PCCC của cơ sở.</w:t>
-      </w:r>
-    </w:p>
-    <w:p>
-      <w:pPr>
-        <w:pStyle w:val="Clause"/>
-        <w:jc w:val="both"/>
-      </w:pPr>
-      <w:r>
-        <w:rPr>
-          <w:rFonts w:ascii="Times New Roman" w:hAnsi="Times New Roman"/>
-          <w:b/>
-          <w:i w:val="0"/>
-          <w:sz w:val="26"/>
-        </w:rPr>
-        <w:t xml:space="preserve">7.2. </w:t>
-      </w:r>
-      <w:r>
-        <w:rPr>
-          <w:rFonts w:ascii="Times New Roman" w:hAnsi="Times New Roman"/>
-          <w:b w:val="0"/>
-          <w:i w:val="0"/>
-          <w:sz w:val="26"/>
-        </w:rPr>
-        <w:t>Không sử dụng nguồn lửa, thiết bị đun nấu hoặc thiết bị điện không bảo đảm an toàn; không sử dụng bếp gas mini, bình gas hoặc thiết bị gas không rõ nguồn gốc, không đáp ứng yêu cầu an toàn.</w:t>
-      </w:r>
-    </w:p>
-    <w:p>
-      <w:pPr>
-        <w:pStyle w:val="Clause"/>
-        <w:jc w:val="both"/>
-      </w:pPr>
-      <w:r>
-        <w:rPr>
-          <w:rFonts w:ascii="Times New Roman" w:hAnsi="Times New Roman"/>
-          <w:b/>
-          <w:i w:val="0"/>
-          <w:sz w:val="26"/>
-        </w:rPr>
-        <w:t xml:space="preserve">7.3. </w:t>
-      </w:r>
-      <w:r>
-        <w:rPr>
-          <w:rFonts w:ascii="Times New Roman" w:hAnsi="Times New Roman"/>
-          <w:b w:val="0"/>
-          <w:i w:val="0"/>
-          <w:sz w:val="26"/>
-        </w:rPr>
-        <w:t>Không che chắn, khóa hoặc cản trở lối thoát nạn, hành lang; không tự ý tháo dỡ, di chuyển hoặc vô hiệu hóa bình chữa cháy, đầu báo, đèn chỉ dẫn và phương tiện PCCC.</w:t>
-      </w:r>
-    </w:p>
-    <w:p>
-      <w:pPr>
-        <w:pStyle w:val="Clause"/>
-        <w:jc w:val="both"/>
-      </w:pPr>
-      <w:r>
-        <w:rPr>
-          <w:rFonts w:ascii="Times New Roman" w:hAnsi="Times New Roman"/>
-          <w:b/>
-          <w:i w:val="0"/>
-          <w:sz w:val="26"/>
-        </w:rPr>
-        <w:t xml:space="preserve">7.4. </w:t>
-      </w:r>
-      <w:r>
-        <w:rPr>
-          <w:rFonts w:ascii="Times New Roman" w:hAnsi="Times New Roman"/>
-          <w:b w:val="0"/>
-          <w:i w:val="0"/>
-          <w:sz w:val="26"/>
-        </w:rPr>
-        <w:t>Tuân thủ nội quy chung về giờ giấc, khách ra vào, tiếng ồn, vệ sinh và khu vực sử dụng chung; sau 22 giờ phải giữ trật tự, hạn chế tiếng ồn ảnh hưởng đến các phòng xung quanh và khu dân cư.</w:t>
-      </w:r>
-    </w:p>
-    <w:p>
-      <w:pPr>
-        <w:pStyle w:val="Clause"/>
-        <w:jc w:val="both"/>
-      </w:pPr>
-      <w:r>
-        <w:rPr>
-          <w:rFonts w:ascii="Times New Roman" w:hAnsi="Times New Roman"/>
-          <w:b/>
-          <w:i w:val="0"/>
-          <w:sz w:val="26"/>
-        </w:rPr>
-        <w:t xml:space="preserve">7.5. </w:t>
-      </w:r>
-      <w:r>
-        <w:rPr>
-          <w:rFonts w:ascii="Times New Roman" w:hAnsi="Times New Roman"/>
-          <w:b w:val="0"/>
-          <w:i w:val="0"/>
-          <w:sz w:val="26"/>
-        </w:rPr>
-        <w:t>Không chứa chấp, sử dụng hàng cấm, tổ chức cờ bạc, gây rối hoặc thực hiện hoạt động trái pháp luật tại phòng và khu vực chung.</w:t>
-      </w:r>
-    </w:p>
-    <w:p>
-      <w:pPr>
-        <w:pStyle w:val="Article"/>
-      </w:pPr>
-      <w:r>
-        <w:t>ĐIỀU 8. SỬA CHỮA, HƯ HỎNG VÀ KIỂM TRA</w:t>
-      </w:r>
-    </w:p>
-    <w:p>
-      <w:pPr>
-        <w:pStyle w:val="Clause"/>
-        <w:jc w:val="both"/>
-      </w:pPr>
-      <w:r>
-        <w:rPr>
-          <w:rFonts w:ascii="Times New Roman" w:hAnsi="Times New Roman"/>
-          <w:b/>
-          <w:i w:val="0"/>
-          <w:sz w:val="26"/>
-        </w:rPr>
-        <w:t xml:space="preserve">8.1. </w:t>
-      </w:r>
-      <w:r>
-        <w:rPr>
-          <w:rFonts w:ascii="Times New Roman" w:hAnsi="Times New Roman"/>
-          <w:b w:val="0"/>
-          <w:i w:val="0"/>
-          <w:sz w:val="26"/>
-        </w:rPr>
-        <w:t>Bên B không tự ý cải tạo hệ thống điện, nước, khoan cắt kết cấu hoặc lắp thiết bị công suất lớn làm tăng nguy cơ mất an toàn khi chưa được Bên A đồng ý.</w:t>
-      </w:r>
-    </w:p>
-    <w:p>
-      <w:pPr>
-        <w:pStyle w:val="Clause"/>
-        <w:jc w:val="both"/>
-      </w:pPr>
-      <w:r>
-        <w:rPr>
-          <w:rFonts w:ascii="Times New Roman" w:hAnsi="Times New Roman"/>
-          <w:b/>
-          <w:i w:val="0"/>
-          <w:sz w:val="26"/>
-        </w:rPr>
-        <w:t xml:space="preserve">8.2. </w:t>
-      </w:r>
-      <w:r>
-        <w:rPr>
-          <w:rFonts w:ascii="Times New Roman" w:hAnsi="Times New Roman"/>
-          <w:b w:val="0"/>
-          <w:i w:val="0"/>
-          <w:sz w:val="26"/>
-        </w:rPr>
-        <w:t>Hư hỏng do hao mòn tự nhiên hoặc lỗi hệ thống thuộc trách nhiệm Bên A được xử lý theo phạm vi nghĩa vụ của Bên A; hư hỏng do lỗi của Bên B, người cùng ở hoặc khách do Bên B quản lý do Bên B chịu chi phí khắc phục.</w:t>
-      </w:r>
-    </w:p>
-    <w:p>
-      <w:pPr>
-        <w:pStyle w:val="Clause"/>
-        <w:jc w:val="both"/>
-      </w:pPr>
-      <w:r>
-        <w:rPr>
-          <w:rFonts w:ascii="Times New Roman" w:hAnsi="Times New Roman"/>
-          <w:b/>
-          <w:i w:val="0"/>
-          <w:sz w:val="26"/>
-        </w:rPr>
-        <w:t xml:space="preserve">8.3. </w:t>
-      </w:r>
-      <w:r>
-        <w:rPr>
-          <w:rFonts w:ascii="Times New Roman" w:hAnsi="Times New Roman"/>
-          <w:b w:val="0"/>
-          <w:i w:val="0"/>
-          <w:sz w:val="26"/>
-        </w:rPr>
-        <w:t>Khi kiểm tra, Bên A phải tôn trọng quyền riêng tư và chỉ kiểm tra trong phạm vi cần thiết; trường hợp khẩn cấp được quyền tiếp cận để xử lý nguy cơ tức thời.</w:t>
-      </w:r>
-    </w:p>
-    <w:p>
-      <w:pPr>
-        <w:pStyle w:val="Article"/>
-      </w:pPr>
-      <w:r>
-        <w:t>ĐIỀU 9. XỬ LÝ VI PHẠM VÀ CHẤM DỨT</w:t>
-      </w:r>
-    </w:p>
-    <w:p>
-      <w:pPr>
-        <w:pStyle w:val="Clause"/>
-        <w:jc w:val="both"/>
-      </w:pPr>
-      <w:r>
-        <w:rPr>
-          <w:rFonts w:ascii="Times New Roman" w:hAnsi="Times New Roman"/>
-          <w:b/>
-          <w:i w:val="0"/>
-          <w:sz w:val="26"/>
-        </w:rPr>
-        <w:t xml:space="preserve">9.1. </w:t>
-      </w:r>
-      <w:r>
-        <w:rPr>
-          <w:rFonts w:ascii="Times New Roman" w:hAnsi="Times New Roman"/>
-          <w:b w:val="0"/>
-          <w:i w:val="0"/>
-          <w:sz w:val="26"/>
-        </w:rPr>
-        <w:t>Vi phạm về PCCC, an ninh trật tự, số người ở, thanh toán hoặc gây thiệt hại phải được khắc phục ngay hoặc trong thời hạn hợp lý tùy tính chất vi phạm.</w:t>
-      </w:r>
-    </w:p>
-    <w:p>
-      <w:pPr>
-        <w:pStyle w:val="Clause"/>
-        <w:jc w:val="both"/>
-      </w:pPr>
-      <w:r>
-        <w:rPr>
-          <w:rFonts w:ascii="Times New Roman" w:hAnsi="Times New Roman"/>
-          <w:b/>
-          <w:i w:val="0"/>
-          <w:sz w:val="26"/>
-        </w:rPr>
-        <w:t xml:space="preserve">9.2. </w:t>
-      </w:r>
-      <w:r>
-        <w:rPr>
-          <w:rFonts w:ascii="Times New Roman" w:hAnsi="Times New Roman"/>
-          <w:b w:val="0"/>
-          <w:i w:val="0"/>
-          <w:sz w:val="26"/>
-        </w:rPr>
-        <w:t>Vi phạm nghiêm trọng, tái diễn hoặc thuộc trường hợp pháp luật cho phép có thể là căn cứ chấm dứt Hợp đồng sau khi thực hiện nghĩa vụ thông báo áp dụng cho trường hợp đó.</w:t>
-      </w:r>
-    </w:p>
-    <w:p>
-      <w:pPr>
-        <w:pStyle w:val="Clause"/>
-        <w:jc w:val="both"/>
-      </w:pPr>
-      <w:r>
-        <w:rPr>
-          <w:rFonts w:ascii="Times New Roman" w:hAnsi="Times New Roman"/>
-          <w:b/>
-          <w:i w:val="0"/>
-          <w:sz w:val="26"/>
-        </w:rPr>
-        <w:t xml:space="preserve">9.3. </w:t>
-      </w:r>
-      <w:r>
-        <w:rPr>
-          <w:rFonts w:ascii="Times New Roman" w:hAnsi="Times New Roman"/>
-          <w:b w:val="0"/>
-          <w:i w:val="0"/>
-          <w:sz w:val="26"/>
-        </w:rPr>
-        <w:t xml:space="preserve">Khi trả phòng, Bên B bàn giao phòng, chìa khóa hoặc thẻ và tài sản; hai bên chốt công nợ và xử lý tiền cọc theo </w:t>
-      </w:r>
-      <w:r>
-        <w:rPr>
-          <w:rFonts w:ascii="Times New Roman" w:hAnsi="Times New Roman"/>
-          <w:b w:val="0"/>
-          <w:i w:val="0"/>
-          <w:sz w:val="26"/>
-        </w:rPr>
-        <w:t>{{deposit.description}}</w:t>
-      </w:r>
-      <w:r>
-        <w:rPr>
-          <w:rFonts w:ascii="Times New Roman" w:hAnsi="Times New Roman"/>
-          <w:b w:val="0"/>
-          <w:i w:val="0"/>
-          <w:sz w:val="26"/>
-        </w:rPr>
-        <w:t>. Chỉ được khấu trừ các khoản có căn cứ và thuộc trách nhiệm của Bên B.</w:t>
-      </w:r>
-    </w:p>
-    <w:p>
-      <w:pPr>
-        <w:pStyle w:val="Article"/>
-      </w:pPr>
-      <w:r>
-        <w:t>ĐIỀU 10. ĐIỀU KHOẢN CHUNG</w:t>
-      </w:r>
-    </w:p>
-    <w:p>
-      <w:pPr>
-        <w:pStyle w:val="Clause"/>
-        <w:jc w:val="both"/>
-      </w:pPr>
-      <w:r>
-        <w:rPr>
-          <w:rFonts w:ascii="Times New Roman" w:hAnsi="Times New Roman"/>
-          <w:b/>
-          <w:i w:val="0"/>
-          <w:sz w:val="26"/>
-        </w:rPr>
-        <w:t xml:space="preserve">10.1. </w:t>
-      </w:r>
-      <w:r>
-        <w:rPr>
-          <w:rFonts w:ascii="Times New Roman" w:hAnsi="Times New Roman"/>
-          <w:b w:val="0"/>
-          <w:i w:val="0"/>
-          <w:sz w:val="26"/>
-        </w:rPr>
-        <w:t>Hợp đồng và các bảng động do HomeSpace sinh ra là một chỉnh thể thống nhất. Nội quy cơ sở không được trái pháp luật hoặc trái thỏa thuận hợp pháp trong Hợp đồng.</w:t>
-      </w:r>
-    </w:p>
-    <w:p>
-      <w:pPr>
-        <w:pStyle w:val="Clause"/>
-        <w:jc w:val="both"/>
-      </w:pPr>
-      <w:r>
-        <w:rPr>
-          <w:rFonts w:ascii="Times New Roman" w:hAnsi="Times New Roman"/>
-          <w:b/>
-          <w:i w:val="0"/>
-          <w:sz w:val="26"/>
-        </w:rPr>
-        <w:t xml:space="preserve">10.2. </w:t>
-      </w:r>
-      <w:r>
-        <w:rPr>
-          <w:rFonts w:ascii="Times New Roman" w:hAnsi="Times New Roman"/>
-          <w:b w:val="0"/>
-          <w:i w:val="0"/>
-          <w:sz w:val="26"/>
-        </w:rPr>
-        <w:t>Mọi sửa đổi, gia hạn hoặc chấm dứt theo thỏa thuận phải được ghi nhận bằng văn bản hoặc phương tiện điện tử có thể lưu trữ, truy xuất.</w:t>
-      </w:r>
-    </w:p>
-    <w:p>
-      <w:pPr>
-        <w:pStyle w:val="Clause"/>
-        <w:jc w:val="both"/>
-      </w:pPr>
-      <w:r>
-        <w:rPr>
-          <w:rFonts w:ascii="Times New Roman" w:hAnsi="Times New Roman"/>
-          <w:b/>
-          <w:i w:val="0"/>
-          <w:sz w:val="26"/>
-        </w:rPr>
-        <w:t xml:space="preserve">10.3. </w:t>
-      </w:r>
-      <w:r>
-        <w:rPr>
-          <w:rFonts w:ascii="Times New Roman" w:hAnsi="Times New Roman"/>
-          <w:b w:val="0"/>
-          <w:i w:val="0"/>
-          <w:sz w:val="26"/>
-        </w:rPr>
-        <w:t>Tranh chấp được ưu tiên thương lượng; nếu không thành, các bên có quyền yêu cầu cơ quan có thẩm quyền giải quyết theo pháp luật Việt Nam.</w:t>
-      </w:r>
-    </w:p>
-    <w:p>
-      <w:pPr>
-        <w:pStyle w:val="Clause"/>
-        <w:jc w:val="both"/>
-      </w:pPr>
-      <w:r>
-        <w:rPr>
-          <w:rFonts w:ascii="Times New Roman" w:hAnsi="Times New Roman"/>
-          <w:b/>
-          <w:i w:val="0"/>
-          <w:sz w:val="26"/>
-        </w:rPr>
-        <w:t xml:space="preserve">10.4. </w:t>
-      </w:r>
-      <w:r>
-        <w:rPr>
-          <w:rFonts w:ascii="Times New Roman" w:hAnsi="Times New Roman"/>
-          <w:b w:val="0"/>
-          <w:i w:val="0"/>
-          <w:sz w:val="26"/>
-        </w:rPr>
-        <w:t>Hợp đồng có hiệu lực theo thỏa thuận của các bên và quy định pháp luật.</w:t>
+        <w:t>7.3. Giữ gìn an ninh trật tự, không mở nhạc lớn sau 22h00; giữ vệ sinh khu vực chung (sân phơi, nhà xe, hành lang).</w:t>
       </w:r>
     </w:p>
     <w:p>
       <w:pPr>
         <w:keepNext/>
-        <w:spacing w:before="200" w:after="160"/>
+        <w:spacing w:before="100" w:after="60"/>
+      </w:pPr>
+      <w:r>
+        <w:rPr>
+          <w:rFonts w:ascii="Times New Roman" w:hAnsi="Times New Roman" w:eastAsia="Times New Roman"/>
+          <w:b/>
+          <w:i w:val="0"/>
+          <w:sz w:val="26"/>
+        </w:rPr>
+        <w:t>ĐIỀU 8. QUY ĐỊNH VỀ VẬT NUÔI VÀ THỎA THUẬN KHÁC</w:t>
+      </w:r>
+    </w:p>
+    <w:p>
+      <w:pPr>
+        <w:spacing w:after="40" w:line="276" w:lineRule="auto"/>
+        <w:ind w:left="0"/>
+        <w:jc w:val="both"/>
+      </w:pPr>
+      <w:r>
+        <w:rPr>
+          <w:rFonts w:ascii="Times New Roman" w:hAnsi="Times New Roman" w:eastAsia="Times New Roman"/>
+          <w:b w:val="0"/>
+          <w:i w:val="0"/>
+          <w:sz w:val="26"/>
+        </w:rPr>
+        <w:t>8.1. Quy định vật nuôi: Chỉ được nuôi nếu khu trọ cho phép (thể hiện tại Bảng tiện ích); Bên B chịu trách nhiệm giữ gìn vệ sinh và không gây ồn ào.</w:t>
+      </w:r>
+    </w:p>
+    <w:p>
+      <w:pPr>
+        <w:keepNext w:val="0"/>
+        <w:spacing w:before="0" w:after="40" w:line="276" w:lineRule="auto"/>
+      </w:pPr>
+      <w:r>
+        <w:rPr>
+          <w:rFonts w:ascii="Times New Roman" w:hAnsi="Times New Roman" w:eastAsia="Times New Roman"/>
+          <w:b w:val="0"/>
+          <w:i w:val="0"/>
+          <w:sz w:val="26"/>
+        </w:rPr>
+        <w:t xml:space="preserve">8.2. Thỏa thuận bổ sung: </w:t>
+      </w:r>
+      <w:r>
+        <w:rPr>
+          <w:rFonts w:ascii="Times New Roman" w:hAnsi="Times New Roman" w:eastAsia="Times New Roman"/>
+          <w:b w:val="0"/>
+          <w:i w:val="0"/>
+          <w:sz w:val="26"/>
+        </w:rPr>
+        <w:t>{{contract.specialTerms}}</w:t>
+      </w:r>
+      <w:r>
+        <w:rPr>
+          <w:rFonts w:ascii="Times New Roman" w:hAnsi="Times New Roman" w:eastAsia="Times New Roman"/>
+          <w:b w:val="0"/>
+          <w:i w:val="0"/>
+          <w:sz w:val="26"/>
+        </w:rPr>
+        <w:t>.</w:t>
+      </w:r>
+    </w:p>
+    <w:p>
+      <w:pPr>
+        <w:keepNext/>
+        <w:spacing w:before="100" w:after="60"/>
+      </w:pPr>
+      <w:r>
+        <w:rPr>
+          <w:rFonts w:ascii="Times New Roman" w:hAnsi="Times New Roman" w:eastAsia="Times New Roman"/>
+          <w:b/>
+          <w:i w:val="0"/>
+          <w:sz w:val="26"/>
+        </w:rPr>
+        <w:t>ĐIỀU 9. CHẤM DỨT HỢP ĐỒNG VÀ HOÀN TRẢ PHÒNG</w:t>
+      </w:r>
+    </w:p>
+    <w:p>
+      <w:pPr>
+        <w:spacing w:after="40" w:line="276" w:lineRule="auto"/>
+        <w:ind w:left="0"/>
+        <w:jc w:val="both"/>
+      </w:pPr>
+      <w:r>
+        <w:rPr>
+          <w:rFonts w:ascii="Times New Roman" w:hAnsi="Times New Roman" w:eastAsia="Times New Roman"/>
+          <w:b w:val="0"/>
+          <w:i w:val="0"/>
+          <w:sz w:val="26"/>
+        </w:rPr>
+        <w:t>9.1. Bên B muốn trả phòng trước hạn phải báo trước tối thiểu theo thỏa thuận, dọn dẹp sạch sẽ và bàn giao lại chìa khóa, hiện trạng phòng.</w:t>
+      </w:r>
+    </w:p>
+    <w:p>
+      <w:pPr>
+        <w:spacing w:after="40" w:line="276" w:lineRule="auto"/>
+        <w:ind w:left="0"/>
+        <w:jc w:val="both"/>
+      </w:pPr>
+      <w:r>
+        <w:rPr>
+          <w:rFonts w:ascii="Times New Roman" w:hAnsi="Times New Roman" w:eastAsia="Times New Roman"/>
+          <w:b w:val="0"/>
+          <w:i w:val="0"/>
+          <w:sz w:val="26"/>
+        </w:rPr>
+        <w:t>9.2. Tiền cọc được xử lý theo thỏa thuận khi có vi phạm hợp đồng hoặc hư hỏng tài sản; việc khấu trừ phải có căn cứ phù hợp với trách nhiệm của Bên B.</w:t>
+      </w:r>
+    </w:p>
+    <w:p>
+      <w:pPr>
+        <w:keepNext/>
+        <w:spacing w:before="100" w:after="60"/>
+      </w:pPr>
+      <w:r>
+        <w:rPr>
+          <w:rFonts w:ascii="Times New Roman" w:hAnsi="Times New Roman" w:eastAsia="Times New Roman"/>
+          <w:b/>
+          <w:i w:val="0"/>
+          <w:sz w:val="26"/>
+        </w:rPr>
+        <w:t>ĐIỀU 10. GIAO KẾT ĐIỆN TỬ VÀ HIỆU LỰC</w:t>
+      </w:r>
+    </w:p>
+    <w:p>
+      <w:pPr>
+        <w:spacing w:after="40" w:line="276" w:lineRule="auto"/>
+        <w:ind w:left="0"/>
+        <w:jc w:val="both"/>
+      </w:pPr>
+      <w:r>
+        <w:rPr>
+          <w:rFonts w:ascii="Times New Roman" w:hAnsi="Times New Roman" w:eastAsia="Times New Roman"/>
+          <w:b w:val="0"/>
+          <w:i w:val="0"/>
+          <w:sz w:val="26"/>
+        </w:rPr>
+        <w:t>10.1. Hợp đồng được giao kết điện tử qua nền tảng HomeSpace theo Luật Giao dịch điện tử.</w:t>
+      </w:r>
+    </w:p>
+    <w:p>
+      <w:pPr>
+        <w:keepNext w:val="0"/>
+        <w:spacing w:before="0" w:after="40" w:line="276" w:lineRule="auto"/>
+      </w:pPr>
+      <w:r>
+        <w:rPr>
+          <w:rFonts w:ascii="Times New Roman" w:hAnsi="Times New Roman" w:eastAsia="Times New Roman"/>
+          <w:b w:val="0"/>
+          <w:i w:val="0"/>
+          <w:sz w:val="26"/>
+        </w:rPr>
+        <w:t xml:space="preserve">10.2. Phiên bản schema: </w:t>
+      </w:r>
+      <w:r>
+        <w:rPr>
+          <w:rFonts w:ascii="Times New Roman" w:hAnsi="Times New Roman" w:eastAsia="Times New Roman"/>
+          <w:b w:val="0"/>
+          <w:i w:val="0"/>
+          <w:sz w:val="26"/>
+        </w:rPr>
+        <w:t>{{contract.schemaVersion}}</w:t>
+      </w:r>
+      <w:r>
+        <w:rPr>
+          <w:rFonts w:ascii="Times New Roman" w:hAnsi="Times New Roman" w:eastAsia="Times New Roman"/>
+          <w:b w:val="0"/>
+          <w:i w:val="0"/>
+          <w:sz w:val="26"/>
+        </w:rPr>
+        <w:t xml:space="preserve">; Số hiệu bản sửa đổi: </w:t>
+      </w:r>
+      <w:r>
+        <w:rPr>
+          <w:rFonts w:ascii="Times New Roman" w:hAnsi="Times New Roman" w:eastAsia="Times New Roman"/>
+          <w:b w:val="0"/>
+          <w:i w:val="0"/>
+          <w:sz w:val="26"/>
+        </w:rPr>
+        <w:t>{{contract.revisionNumber}}</w:t>
+      </w:r>
+      <w:r>
+        <w:rPr>
+          <w:rFonts w:ascii="Times New Roman" w:hAnsi="Times New Roman" w:eastAsia="Times New Roman"/>
+          <w:b w:val="0"/>
+          <w:i w:val="0"/>
+          <w:sz w:val="26"/>
+        </w:rPr>
+        <w:t>.</w:t>
+      </w:r>
+    </w:p>
+    <w:p>
+      <w:pPr>
+        <w:spacing w:after="40" w:line="276" w:lineRule="auto"/>
+        <w:ind w:left="0"/>
+        <w:jc w:val="both"/>
+      </w:pPr>
+      <w:r>
+        <w:rPr>
+          <w:rFonts w:ascii="Times New Roman" w:hAnsi="Times New Roman" w:eastAsia="Times New Roman"/>
+          <w:b w:val="0"/>
+          <w:i w:val="0"/>
+          <w:sz w:val="26"/>
+        </w:rPr>
+        <w:t>10.3. Hợp đồng có hiệu lực sau khi hai bên hoàn tất xác nhận điện tử.</w:t>
+      </w:r>
+    </w:p>
+    <w:p>
+      <w:pPr>
+        <w:pageBreakBefore/>
         <w:jc w:val="center"/>
       </w:pPr>
       <w:r>
         <w:rPr>
-          <w:rFonts w:ascii="Times New Roman" w:hAnsi="Times New Roman"/>
+          <w:rFonts w:ascii="Times New Roman" w:hAnsi="Times New Roman" w:eastAsia="Times New Roman"/>
           <w:b/>
           <w:i w:val="0"/>
           <w:sz w:val="26"/>
@@ -2175,32 +1845,16 @@
         <w:jc w:val="center"/>
         <w:tblLayout w:type="fixed"/>
         <w:tblLook w:firstColumn="1" w:firstRow="1" w:lastColumn="0" w:lastRow="0" w:noHBand="0" w:noVBand="1" w:val="04A0"/>
-        <w:tblBorders>
-          <w:top w:val="nil" w:sz="4" w:color="D9D9D9"/>
-          <w:left w:val="nil" w:sz="4" w:color="D9D9D9"/>
-          <w:bottom w:val="nil" w:sz="4" w:color="D9D9D9"/>
-          <w:right w:val="nil" w:sz="4" w:color="D9D9D9"/>
-          <w:insideH w:val="nil" w:sz="4" w:color="D9D9D9"/>
-          <w:insideV w:val="nil" w:sz="4" w:color="D9D9D9"/>
-        </w:tblBorders>
       </w:tblPr>
       <w:tblGrid>
-        <w:gridCol w:w="4677"/>
-        <w:gridCol w:w="4677"/>
+        <w:gridCol w:w="4986"/>
+        <w:gridCol w:w="4986"/>
       </w:tblGrid>
       <w:tr>
-        <w:trPr>
-          <w:cantSplit/>
-        </w:trPr>
         <w:tc>
           <w:tcPr>
-            <w:tcW w:type="dxa" w:w="4535"/>
-            <w:tcMar>
-              <w:top w:w="80" w:type="dxa"/>
-              <w:start w:w="80" w:type="dxa"/>
-              <w:bottom w:w="80" w:type="dxa"/>
-              <w:end w:w="80" w:type="dxa"/>
-            </w:tcMar>
+            <w:tcW w:type="dxa" w:w="4649"/>
+            <w:vAlign w:val="center"/>
           </w:tcPr>
           <w:p>
             <w:pPr>
@@ -2208,22 +1862,51 @@
             </w:pPr>
             <w:r>
               <w:rPr>
-                <w:rFonts w:ascii="Times New Roman" w:hAnsi="Times New Roman"/>
+                <w:rFonts w:ascii="Times New Roman" w:hAnsi="Times New Roman" w:eastAsia="Times New Roman"/>
                 <w:b/>
+                <w:i w:val="0"/>
                 <w:sz w:val="26"/>
               </w:rPr>
               <w:t>BÊN CHO THUÊ (BÊN A)</w:t>
             </w:r>
           </w:p>
+        </w:tc>
+        <w:tc>
+          <w:tcPr>
+            <w:tcW w:type="dxa" w:w="4649"/>
+            <w:vAlign w:val="center"/>
+          </w:tcPr>
           <w:p>
             <w:pPr>
               <w:jc w:val="center"/>
             </w:pPr>
             <w:r>
               <w:rPr>
-                <w:rFonts w:ascii="Times New Roman" w:hAnsi="Times New Roman"/>
-                <w:i/>
-                <w:sz w:val="24"/>
+                <w:rFonts w:ascii="Times New Roman" w:hAnsi="Times New Roman" w:eastAsia="Times New Roman"/>
+                <w:b/>
+                <w:i w:val="0"/>
+                <w:sz w:val="26"/>
+              </w:rPr>
+              <w:t>BÊN THUÊ (BÊN B)</w:t>
+            </w:r>
+          </w:p>
+        </w:tc>
+      </w:tr>
+      <w:tr>
+        <w:tc>
+          <w:tcPr>
+            <w:tcW w:type="dxa" w:w="4649"/>
+          </w:tcPr>
+          <w:p>
+            <w:pPr>
+              <w:jc w:val="center"/>
+            </w:pPr>
+            <w:r>
+              <w:rPr>
+                <w:rFonts w:ascii="Times New Roman" w:hAnsi="Times New Roman" w:eastAsia="Times New Roman"/>
+                <w:b w:val="0"/>
+                <w:i w:val="0"/>
+                <w:sz w:val="26"/>
               </w:rPr>
               <w:t>(Ký, ghi rõ họ tên hoặc ký điện tử)</w:t>
             </w:r>
@@ -2235,13 +1918,7 @@
         </w:tc>
         <w:tc>
           <w:tcPr>
-            <w:tcW w:type="dxa" w:w="4535"/>
-            <w:tcMar>
-              <w:top w:w="80" w:type="dxa"/>
-              <w:start w:w="80" w:type="dxa"/>
-              <w:bottom w:w="80" w:type="dxa"/>
-              <w:end w:w="80" w:type="dxa"/>
-            </w:tcMar>
+            <w:tcW w:type="dxa" w:w="4649"/>
           </w:tcPr>
           <w:p>
             <w:pPr>
@@ -2249,22 +1926,10 @@
             </w:pPr>
             <w:r>
               <w:rPr>
-                <w:rFonts w:ascii="Times New Roman" w:hAnsi="Times New Roman"/>
-                <w:b/>
+                <w:rFonts w:ascii="Times New Roman" w:hAnsi="Times New Roman" w:eastAsia="Times New Roman"/>
+                <w:b w:val="0"/>
+                <w:i w:val="0"/>
                 <w:sz w:val="26"/>
-              </w:rPr>
-              <w:t>BÊN THUÊ (BÊN B)</w:t>
-            </w:r>
-          </w:p>
-          <w:p>
-            <w:pPr>
-              <w:jc w:val="center"/>
-            </w:pPr>
-            <w:r>
-              <w:rPr>
-                <w:rFonts w:ascii="Times New Roman" w:hAnsi="Times New Roman"/>
-                <w:i/>
-                <w:sz w:val="24"/>
               </w:rPr>
               <w:t>(Ký, ghi rõ họ tên hoặc ký điện tử)</w:t>
             </w:r>
@@ -2279,8 +1944,8 @@
     <w:sectPr>
       <w:headerReference w:type="default" r:id="rId9"/>
       <w:footerReference w:type="default" r:id="rId10"/>
-      <w:pgSz w:w="11906" w:h="16838"/>
-      <w:pgMar w:top="1020" w:right="1134" w:bottom="964" w:left="1417" w:header="454" w:footer="454" w:gutter="0"/>
+      <w:pgSz w:w="12240" w:h="15840"/>
+      <w:pgMar w:top="964" w:right="1020" w:bottom="964" w:left="1247" w:header="720" w:footer="720" w:gutter="0"/>
       <w:cols w:space="720"/>
       <w:docGrid w:linePitch="360"/>
     </w:sectPr>
@@ -2298,11 +1963,11 @@
     <w:r>
       <w:rPr>
         <w:rFonts w:ascii="Times New Roman" w:hAnsi="Times New Roman"/>
-        <w:sz w:val="20"/>
+        <w:sz w:val="18"/>
       </w:rPr>
       <w:t xml:space="preserve">Trang </w:t>
       <w:fldChar w:fldCharType="begin"/>
-      <w:instrText xml:space="preserve"> PAGE </w:instrText>
+      <w:instrText xml:space="preserve">PAGE</w:instrText>
       <w:fldChar w:fldCharType="end"/>
     </w:r>
   </w:p>
@@ -2318,7 +1983,8 @@
     </w:pPr>
     <w:r>
       <w:rPr>
-        <w:rFonts w:ascii="Times New Roman" w:hAnsi="Times New Roman"/>
+        <w:rFonts w:ascii="Times New Roman" w:hAnsi="Times New Roman" w:eastAsia="Times New Roman"/>
+        <w:b w:val="0"/>
         <w:i/>
         <w:sz w:val="18"/>
       </w:rPr>
@@ -2691,10 +2357,6 @@
     <w:name w:val="Normal"/>
     <w:qFormat/>
     <w:rsid w:val="00FC693F"/>
-    <w:pPr>
-      <w:spacing w:line="269" w:lineRule="auto" w:after="60" w:before="0"/>
-      <w:ind w:firstLine="0"/>
-    </w:pPr>
     <w:rPr>
       <w:rFonts w:ascii="Times New Roman" w:hAnsi="Times New Roman" w:eastAsia="Times New Roman"/>
       <w:sz w:val="26"/>
@@ -14381,29 +14043,6 @@
         <w:shd w:val="clear" w:color="auto" w:fill="FBCAA2" w:themeFill="accent6" w:themeFillTint="7F"/>
       </w:tcPr>
     </w:tblStylePr>
-  </w:style>
-  <w:style w:type="paragraph" w:customStyle="1" w:styleId="Article">
-    <w:name w:val="Article"/>
-    <w:pPr>
-      <w:keepNext/>
-      <w:spacing w:before="140" w:after="60"/>
-    </w:pPr>
-    <w:rPr>
-      <w:rFonts w:ascii="Times New Roman" w:hAnsi="Times New Roman" w:eastAsia="Times New Roman"/>
-      <w:b/>
-      <w:sz w:val="26"/>
-    </w:rPr>
-  </w:style>
-  <w:style w:type="paragraph" w:customStyle="1" w:styleId="Clause">
-    <w:name w:val="Clause"/>
-    <w:pPr>
-      <w:spacing w:line="269" w:lineRule="auto" w:after="60"/>
-      <w:jc w:val="both"/>
-    </w:pPr>
-    <w:rPr>
-      <w:rFonts w:ascii="Times New Roman" w:hAnsi="Times New Roman" w:eastAsia="Times New Roman"/>
-      <w:sz w:val="26"/>
-    </w:rPr>
   </w:style>
 </w:styles>
 </file>

</xml_diff>